<commit_message>
Esther: MSG 전수 감사 완료 — EN 38문단·KO 35문단 수정, 10장 배지 재정렬, split 13건, validator PASS, Docs 업로드(제목 정정)
</commit_message>
<xml_diff>
--- a/gdocs_build/Esther.docx
+++ b/gdocs_build/Esther.docx
@@ -124,7 +124,7 @@
               <w:rPr>
                 <w:sz w:val="18"/>
               </w:rPr>
-              <w:t>So get this, this all went down back in the day with this king named Xerxes. This king ruled a massive empire that stretched all the way from India to Ethiopia—like, 127 different regions. King Xerxes was chilling on his throne in the capital city, Susa.</w:t>
+              <w:t>So get this, this all went down back in the day with this king named Xerxes. This dude was the ruler of a massive empire that stretched all the way from India to Ethiopia—like, 127 different regions. King Xerxes was chilling on his throne in the capital city, Susa.</w:t>
             </w:r>
           </w:p>
         </w:tc>
@@ -266,7 +266,7 @@
               <w:rPr>
                 <w:sz w:val="18"/>
               </w:rPr>
-              <w:t>For a solid six months, he was just showing off all the crazy rich stuff his kingdom had and how awesome his palace was. After that massive display, the king threw another party, this one for a whole week, for every single person living in the capital, Susa—didn't matter if you were a big shot or a nobody. The party was in the super fancy garden of the king's summer house. The whole place was decked out with white and blue curtains, tied up with fancy purple cords to silver rings on marble pillars. They had couches made of silver and gold set up on this insane mosaic floor made of all kinds of expensive stones. Drinks were served in solid gold cups, and get this—every single cup was one of a kind. The royal wine was flowing like water, 'cause the king was being super generous.</w:t>
+              <w:t>For a solid six months, he was just showing off, putting on display all the crazy rich stuff his kingdom had and how stunningly beautiful his royal palace was. After that massive display, the king threw another party, this one for a whole week, for every single person living in the capital, Susa—didn't matter if you were a big shot or a nobody. The party was in the super fancy garden courtyard of the king's summer house. The whole place was decked out with white and blue cotton curtains, tied up with linen and purple cords to silver rings on marble pillars. They had couches made of silver and gold set up on this insane mosaic floor made of porphyry, marble, mother-of-pearl, and colored stones. Drinks were served in solid gold cups, and get this—every single cup was one of a kind. The royal wine was flowing like water, 'cause the king was being super generous.</w:t>
             </w:r>
           </w:p>
         </w:tc>
@@ -289,7 +289,7 @@
               <w:rPr>
                 <w:sz w:val="18"/>
               </w:rPr>
-              <w:t>무려 여섯 달 동안 자기 왕국이 얼마나 부자인지, 왕궁이 얼마나 휘황찬란한지 자랑을 엄청 했대. 완전 자랑 모드였던 거지. 그 전시회가 끝나고 나서는, 왕이 수도 수산에 사는 모든 사람들을 위해 일주일짜리 파티를 또 열었음. 신분이 높든 낮든 상관없이 다 부른 거임. 파티는 왕의 여름 별장 정원에서 열렸는데, 흰색이랑 파란색 천으로 된 커튼이 아마포랑 보라색 끈으로 대리석 기둥 은고리에 묶여있는, 완전 화려하게 꾸며져 있었대. 은이랑 금으로 만든 소파는 반암, 대리석, 자개, 유색석으로 된 모자이크 바닥 위에 쫙 깔려 있었고. 술은 전부 금잔에 담아 줬는데, 잔 모양이 하나같이 다 달랐대. 왕이 한턱 쏘는 거라 왕실 와인이 아주 펑펑 나왔다고 함.</w:t>
+              <w:t>무려 여섯 달 동안 자기 왕국이 얼마나 부자인지, 왕궁이 얼마나 휘황찬란한지 자랑질을 했대. 완전 자랑 모드였던 거지. 그 전시회가 끝나고 나서는, 왕이 수도 수산에 사는 모든 사람들을 위해 일주일짜리 파티를 또 열었음. 신분이 높든 낮든 상관없이 다 부른 거임. 파티는 왕의 여름 별장 정원에서 열렸는데, 흰색이랑 파란색 면 커튼이 아마포랑 보라색 끈으로 대리석 기둥 은고리에 묶여있는, 완전 화려하게 꾸며져 있었대. 은이랑 금으로 만든 소파는 반암, 대리석, 자개, 유색석으로 된 모자이크 바닥 위에 쫙 깔려 있었고. 술은 전부 금잔에 담아 줬는데, 잔 모양이 하나같이 다 달랐대. 왕이 한턱 쏘는 거라 왕실 와인이 아주 펑펑 나왔다고 함.</w:t>
             </w:r>
           </w:p>
         </w:tc>
@@ -337,7 +337,7 @@
               <w:rPr>
                 <w:sz w:val="18"/>
               </w:rPr>
-              <w:t>Basically, you could drink as much as you wanted. The king ordered the waiters to just keep refilling everyone's cup. Meanwhile, Queen Vashti was having her own party for the women inside King Xerxes's main palace.</w:t>
+              <w:t>Basically, you could drink as much as you wanted. The king ordered the waiters to just keep refilling everyone's cup. Meanwhile, Queen Vashti was having her own party for the women inside King Xerxes's royal palace.</w:t>
             </w:r>
           </w:p>
         </w:tc>
@@ -360,7 +360,7 @@
               <w:rPr>
                 <w:sz w:val="18"/>
               </w:rPr>
-              <w:t>손님들은 원하는 만큼 마실 수 있었음. 왕이 직접 내린 명령이었거든. 웨이터들이 옆에 딱 붙어서 계속 술을 채워줬지. 한편, 와쉬티 왕비는 왕궁 안에서 여자들끼리 따로 파티를 하고 있었대.</w:t>
+              <w:t>손님들은 원하는 만큼 마실 수 있었음. 왕이 직접 내린 명령이었거든. 웨이터들이 옆에 딱 붙어서 계속 술을 채워줬지. 한편, 와쉬티 왕비는 크세르크세스 왕의 왕궁 안에서 여자들끼리 따로 파티를 하고 있었대.</w:t>
             </w:r>
           </w:p>
         </w:tc>
@@ -408,7 +408,7 @@
               <w:rPr>
                 <w:sz w:val="18"/>
               </w:rPr>
-              <w:t>On the seventh and final day of the party, the king, who was pretty drunk by this point, told his seven personal servants — Mehuman, Biztha, Harbona, Bigtha, Abagtha, Zethar, and Carcas — to go get Queen Vashti. He wanted her to come out wearing her royal crown so he could show off to all his guests how beautiful she was. And yeah, she was absolutely stunning.</w:t>
+              <w:t>On the seventh and final day of the party, the king, who was pretty drunk by this point, told his seven personal eunuch servants—Mehuman, Biztha, Harbona, Bigtha, Abagtha, Zethar, and Carcas—to go get Queen Vashti. He wanted her to come out wearing her royal crown so he could show off to all his guests how beautiful she was. And yeah, she was absolutely stunning.</w:t>
             </w:r>
           </w:p>
         </w:tc>
@@ -431,7 +431,7 @@
               <w:rPr>
                 <w:sz w:val="18"/>
               </w:rPr>
-              <w:t>파티 7일째 되는 날, 왕이 술에 거하게 취해서는 자기 개인 시종인 므후만, 비스다, 하르보나, 빅다, 아박다, 제달, 가르가스, 이렇게 일곱 명의 내시한테 명령을 내렸어. 와쉬티 왕비를 왕관 쓴 제일 예쁜 모습으로 데려오라는 거였지. 사람들한테 자기 아내가 얼마나 예쁜지 자랑하고 싶었던 거임. 실제로도 왕비는 진짜 예뻤다고 함.</w:t>
+              <w:t>파티 7일째 되는 날, 왕이 술에 거하게 취해서는 자기 개인 시종인 므후만, 비스다, 하르보나, 빅다, 아박다, 제달, 가르가스, 이렇게 일곱 명의 내시한테 명령을 내렸어. 와쉬티 왕비를 왕관 쓴 제일 예쁜 모습으로 데려오라는 거였지. 사람들한테 자기 아내가 얼마나 예쁜지 자랑하고 싶었던 거임. 실제로도 왕비는 존예였다고 함.</w:t>
             </w:r>
           </w:p>
         </w:tc>
@@ -479,7 +479,7 @@
               <w:rPr>
                 <w:sz w:val="18"/>
               </w:rPr>
-              <w:t>But Queen Vashti was like, 'Nah,' and straight up refused to come. She rejected the king's order that the servants delivered. The king completely lost it. He was absolutely fuming that she would disrespect him like that. So, he called in his advisors, who were all experts on the law. It was his thing to always ask his experts for advice. His inner circle included guys named Carshena, Shethar, Admatha, Tarshish, Meres, Marsena, and Memucan—the seven most powerful princes in the kingdom who could always talk to the king. He asked them what the law says he can do about Queen Vashti ignoring King Xerxes's direct order.</w:t>
+              <w:t>But Queen Vashti was like, 'Nah,' and straight up refused to come. She rejected the king's order that the servants delivered. The king completely lost it. He was absolutely fuming that she would disrespect him like that. So, he called in his advisors, who were all experts on the law. It was his thing to always ask his experts for advice. His inner circle included guys named Carshena, Shethar, Admatha, Tarshish, Meres, Marsena, and Memucan—the seven most powerful princes of Persia and Media who could always talk to the king. He asked them what legal options they had against Queen Vashti for ignoring King Xerxes's summons delivered by the eunuchs.</w:t>
             </w:r>
           </w:p>
         </w:tc>
@@ -502,7 +502,7 @@
               <w:rPr>
                 <w:sz w:val="18"/>
               </w:rPr>
-              <w:t>근데 와쉬티 왕비가 안 온다고 한 거임. 내시들이 전한 왕의 명령을 그냥 무시해버렸어. 그 소식 듣고 왕이 완전 화난 거지. 감히 자기 말을 무시했다는 생각에 부들부들 떨면서 법률 전문가인 고문들을 불렀어. 이 왕은 원래 무슨 일만 있으면 전문가들한테 물어보는 스타일이었거든. 왕이랑 제일 가까운 고문들은 가르스나, 세달, 아드마다, 다시스, 메레스, 마르스나, 므무간, 이렇게 일곱 명이었는데, 페르시아랑 메디아에서 제일 잘나가는 왕자들이었고 왕한테 직통으로 말할 수 있는 실세들이었음. 왕이 그들한테 와쉬티 왕비가 내시들을 통해 전한 자기 명령을 무시했는데, 법적으로 어떻게 처리할 수 있는지 물어봤어.</w:t>
+              <w:t>근데 와쉬티 왕비가 안 온다고 한 거임. 내시들이 전한 왕의 명령을 그냥 무시했어. 그 소식 듣고 왕이 완전 화난 거지. 감히 자기 말을 무시했다는 생각에 부들부들 떨면서 법률 전문가인 고문들을 불렀어. 이 왕은 원래 무슨 일만 있으면 전문가들한테 물어보는 스타일이었거든. 왕이랑 제일 가까운 고문들은 가르스나, 세달, 아드마다, 다시스, 메레스, 마르스나, 므무간, 이렇게 일곱 명이었는데, 페르시아랑 메디아에서 제일 잘나가는 왕자들이었고 왕한테 직통으로 말할 수 있는 실세들이었음. 왕이 그들한테 와쉬티 왕비가 내시들을 통해 전한 크세르크세스 왕의 명령을 무시했는데, 법적으로 어떻게 처리할 수 있는지 물어봤어.</w:t>
             </w:r>
           </w:p>
         </w:tc>
@@ -550,7 +550,7 @@
               <w:rPr>
                 <w:sz w:val="18"/>
               </w:rPr>
-              <w:t>Then this guy Memucan spoke up in front of the king and all the other princes: “Look, Queen Vashti didn't just disrespect you, King. She dissed all of us, all the leaders and all the people in every single one of your provinces. The news is gonna spread like wildfire: ‘Yo, did you hear about Queen Vashti? The king told her to come, and she just said no!’ When other women hear this, they're all gonna start treating their own husbands with zero respect. The second the wives of the Persian and Mede officials hear what the queen did, they'll go wild. Is that what we really want? A whole country full of angry women who don't know their place?”</w:t>
+              <w:t>Then this guy Memucan spoke up in front of the king and all the other princes: “Look, Queen Vashti didn't just disrespect you, King. She dissed all of us, all the leaders and all the people in every single one of your provinces. The news is gonna spread like wildfire: ‘Yo, did you hear about Queen Vashti? King Xerxes told her to come, and she just said no!’ When other women hear this, they're all gonna start treating their own husbands with zero respect. The day the wives of the Persian and Mede officials hear what the queen did, they'll be out of control. Is that what we really want? A whole country full of angry women who don't know their place?”</w:t>
             </w:r>
           </w:p>
         </w:tc>
@@ -573,7 +573,7 @@
               <w:rPr>
                 <w:sz w:val="18"/>
               </w:rPr>
-              <w:t>그때 므무간이 왕이랑 왕자들 앞에서 딱 나서서 말하는 거임. “와쉬티 왕비가 모욕한 건 왕뿐만이 아닙니다. 이건 우리 모두, 즉 모든 지도자들과 왕의 모든 지방에 있는 백성들까지 다 망신을 준 겁니다. 곧 소문이 쫙 퍼질 겁니다. ‘야, 와쉬티 왕비 얘기 들었냐? 크세르크세스 왕이 오라고 했는데 안 간대!’ 여자들이 이 소문을 들으면 다들 자기 남편을 무시하기 시작할 겁니다. 페르시아랑 메디아 고관들의 아내들이 왕비가 얼마나 대담한지 알게 되는 순간, 걔네도 통제 불능이 될 거라고요. 우리가 원하는 게 이런 겁니까? 자기 분수도 모르는 성난 여자들로 가득 찬 나라?”</w:t>
+              <w:t>그때 므무간이 왕이랑 왕자들 앞에서 딱 나서서 말하는 거임. “와쉬티 왕비가 모욕한 건 왕뿐만이 아닙니다. 이건 우리 모두, 즉 모든 지도자들과 왕의 모든 지방에 있는 백성들까지 다 망신을 준 겁니다. 곧 소문이 쫙 퍼질 겁니다. ‘야, 와쉬티 왕비 얘기 들었냐? 크세르크세스 왕이 오라고 했는데 무시했대!’ 여자들이 이 소문을 들으면 다들 자기 남편을 무시하기 시작할 겁니다. 페르시아랑 메디아 고관들의 아내들이 왕비가 얼마나 대담한지 알게 되는 순간, 걔네도 통제 불능이 될 거라고요. 우리가 원하는 게 이런 겁니까? 자기 분수도 모르는 성난 여자들로 가득 찬 나라?”</w:t>
             </w:r>
           </w:p>
         </w:tc>
@@ -621,7 +621,7 @@
               <w:rPr>
                 <w:sz w:val="18"/>
               </w:rPr>
-              <w:t>“So, if you're cool with it, King, you should make a royal decree. Write it into the official laws of Persia and Media so it can never be changed. The law should say that Vashti is banned from ever being in your presence again. And then, you should give her royal title to a woman who's actually better and knows her place. When this new rule is announced all over your massive kingdom, every single woman, no matter if she's rich or poor, will have to show proper respect to her husband.”</w:t>
+              <w:t>“So, if you're cool with it, King, you should make a royal decree. Have it recorded in the laws of the Persians and Medes so it can never be revoked. The law should say that Vashti is permanently banned from King Xerxes' presence. And then, you should give her royal title to a woman who knows her place. When this new rule is announced all over your massive kingdom, every single woman, no matter if she's rich or poor, will have to show proper respect to her husband.”</w:t>
             </w:r>
           </w:p>
         </w:tc>
@@ -644,7 +644,7 @@
               <w:rPr>
                 <w:sz w:val="18"/>
               </w:rPr>
-              <w:t>“그러니, 왕께서 괜찮으시다면, 왕의 명령을 공표하시고 페르시아와 메디아의 법에 기록해서 절대 바꿀 수 없게 만드십시오. 와쉬티는 영원히 왕 앞에 나타나지 못하게 금지하고, 왕비의 자리는 분수를 아는 다른 여자에게 주십시오. 왕의 이 결정이 온 나라에 알려지면, 사회적 지위가 어떻든 간에 모든 아내들이 자기 남편에게 제대로 존경을 표하게 될 것입니다.”</w:t>
+              <w:t>“그러니, 왕께서 괜찮으시다면, 왕의 명령을 공표하시고 페르시아인과 메대인의 법에 기록해서 절대 번복할 수 없게 만드십시오. 와쉬티는 크세르크세스 왕 앞에 영원히 나타나지 못하게 금지하고, 왕비의 자리는 분수를 아는 다른 여자에게 주십시오. 왕의 이 결정이 온 나라에 알려지면, 사회적 지위가 어떻든 간에 모든 아내들이 자기 남편에게 제대로 존경을 표하게 될 것입니다.”</w:t>
             </w:r>
           </w:p>
         </w:tc>
@@ -726,7 +726,7 @@
         <w:pStyle w:val="Heading1"/>
       </w:pPr>
       <w:r>
-        <w:t>Chapter 2 — The Royal Rise: From Unknown to Queen</w:t>
+        <w:t>Chapter 2 — The Royal Rise: From Zero to Hero</w:t>
       </w:r>
     </w:p>
     <w:tbl>
@@ -799,7 +799,7 @@
                 <w:b/>
                 <w:sz w:val="16"/>
               </w:rPr>
-              <w:t>1-4</w:t>
+              <w:t>1-3</w:t>
             </w:r>
           </w:p>
           <w:p>
@@ -830,7 +830,7 @@
                 <w:b/>
                 <w:sz w:val="16"/>
               </w:rPr>
-              <w:t>1-4</w:t>
+              <w:t>1-3</w:t>
             </w:r>
           </w:p>
           <w:p>
@@ -838,7 +838,7 @@
               <w:rPr>
                 <w:sz w:val="18"/>
               </w:rPr>
-              <w:t>So, after a while, King Xerxes wasn't as mad at Queen Vashti anymore. He started having second thoughts about the whole situation and what he'd ordered. His crew of young assistants saw their chance and were like, “Yo, let's find some beautiful young virgins for the king.” They suggested the king get officials in every part of his kingdom to bring every beautiful young virgin to the palace in Susa. They'd go to the harem, which was run by this guy Hegai, the king's eunuch in charge of the women. He'd get them all set up with spa treatments and everything. Then, the girl who pleases the king the most would become the new queen instead of Vashti. The king was totally on board with this plan and made it happen.</w:t>
+              <w:t>So, after a while, King Xerxes wasn't as mad at Queen Vashti anymore. He was having second thoughts about what Vashti had done and what he'd ordered against her. His crew of young assistants saw their chance and were like, “Yo, let's find some amazing, beautiful young women for the king.” They suggested the king get officials in every part of his kingdom to bring all the beautiful, single ladies to the palace in Susa. They'd go to the harem, which was run by this guy Hegai, the king's eunuch in charge of the women. He'd get them all set up with spa treatments and everything. Then, the girl who pleases the king the most would become the new queen instead of Vashti.</w:t>
             </w:r>
           </w:p>
         </w:tc>
@@ -853,7 +853,7 @@
                 <w:b/>
                 <w:sz w:val="16"/>
               </w:rPr>
-              <w:t>1-4</w:t>
+              <w:t>1-3</w:t>
             </w:r>
           </w:p>
           <w:p>
@@ -861,7 +861,7 @@
               <w:rPr>
                 <w:sz w:val="18"/>
               </w:rPr>
-              <w:t>나중에 크세르크세스 왕이 화가 좀 풀리고 나니까, 와쉬티한테 했던 일이랑 자기가 내린 명령을 후회하게 된 거임. 왕을 모시던 젊은 신하들이 이때다 싶어서 “왕을 위해서 예쁜 처녀들을 찾아봅시다” 하고 나선 거지. 왕국의 각 지방에 관리들을 보내서 예쁜 처녀들을 다 수사 궁으로 데려오게 하자는 거였음. 여자들을 관리하는 왕의 내시인 헤개가 운영하는 후궁으로 보내서, 거기서 피부 관리 풀코스를 받게 하자는 계획이었지. 그러고 나서 왕의 마음에 가장 쏙 드는 여자를 와쉬티 대신 새 왕비로 삼자는 거였어. 왕은 이 아이디어가 맘에 들어서 바로 오케이했대.</w:t>
+              <w:t>나중에 크세르크세스 왕이 화가 좀 풀리고 나니까, 와쉬티한테 했던 일이랑 자기가 내린 명령에 대해 후회하며 다시 생각하게 된 거임. 왕을 모시던 젊은 신하들이 이때다 싶어서 “왕을 위해서 예쁜 처녀들을 찾아봅시다” 하고 나선 거지. 왕국의 각 지방에 관리들을 보내서 예쁜 처녀들을 다 수사 궁으로 데려오게 하자는 거였음. 여자들을 관리하는 왕의 내시인 헤개가 운영하는 후궁으로 보내서, 거기서 피부 관리를 받게 하자는 계획이었지. 그러고 나서 왕의 마음에 가장 쏙 드는 여자를 와쉬티 대신 새 왕비로 삼자는 거였어.</w:t>
             </w:r>
           </w:p>
         </w:tc>
@@ -878,7 +878,7 @@
                 <w:b/>
                 <w:sz w:val="16"/>
               </w:rPr>
-              <w:t>5-7</w:t>
+              <w:t>4</w:t>
             </w:r>
           </w:p>
           <w:p>
@@ -886,7 +886,7 @@
               <w:rPr>
                 <w:sz w:val="18"/>
               </w:rPr>
-              <w:t>Now there was a Jew who lived in the palace complex in Susa. His name was Mordecai the son of Jair, the son of Shimei, the son of Kish—a Benjaminite. His ancestors had been taken from Jerusalem with the exiles and carried off with King Jehoiachin of Judah by King Nebuchadnezzar of Babylon into exile. Mordecai had raised his cousin Hadassah, otherwise known as Esther, since she had no father or mother. The girl had a good figure and a beautiful face. After her parents died, Mordecai had adopted her.</w:t>
+              <w:t>↑ 위 MSG(1-4) 계속</w:t>
             </w:r>
           </w:p>
         </w:tc>
@@ -901,7 +901,7 @@
                 <w:b/>
                 <w:sz w:val="16"/>
               </w:rPr>
-              <w:t>5-7</w:t>
+              <w:t>4</w:t>
             </w:r>
           </w:p>
           <w:p>
@@ -909,7 +909,7 @@
               <w:rPr>
                 <w:sz w:val="18"/>
               </w:rPr>
-              <w:t>Now, there was this Jewish guy named Mordecai living in the palace complex at Susa. He was the son of Jair, the grandson of Shimei, the great-grandson of Kish — a Benjaminite. His family had been carried off from Jerusalem into exile in Babylon with King Jehoiachin of Judah when King Nebuchadnezzar of Babylon took them captive. Mordecai had raised his cousin, Hadassah, who everyone called Esther, because her parents had passed away. She was seriously stunning, with a great figure and a beautiful face. After her parents died, Mordecai basically adopted her.</w:t>
+              <w:t>The king was totally on board with this plan and made it happen.</w:t>
             </w:r>
           </w:p>
         </w:tc>
@@ -924,7 +924,7 @@
                 <w:b/>
                 <w:sz w:val="16"/>
               </w:rPr>
-              <w:t>5-7</w:t>
+              <w:t>4</w:t>
             </w:r>
           </w:p>
           <w:p>
@@ -932,7 +932,7 @@
               <w:rPr>
                 <w:sz w:val="18"/>
               </w:rPr>
-              <w:t>그때 수사 궁에 모르드개라는 유대인이 살고 있었는데, 야일의 아들이고 시므이의 손자, 기스의 증손자로 베냐민 지파 사람이었음. 바빌론 왕 느부갓네살이 유다 왕 여호야긴이랑 사람들을 예루살렘에서 포로로 잡아갈 때, 모르드개의 조상들도 함께 끌려갔던 거지. 모르드개는 부모님이 안 계신 사촌 동생 하닷사, 다른 이름으로는 에스더를 딸처럼 키웠대. 에스더는 몸매도 좋고 얼굴도 진짜 예뻤던 거임. 부모님이 돌아가신 후에 모르드개가 입양한 거지.</w:t>
+              <w:t>왕은 이 아이디어가 맘에 들어서 바로 오케이했대.</w:t>
             </w:r>
           </w:p>
         </w:tc>
@@ -949,7 +949,7 @@
                 <w:b/>
                 <w:sz w:val="16"/>
               </w:rPr>
-              <w:t>8</w:t>
+              <w:t>5-7</w:t>
             </w:r>
           </w:p>
           <w:p>
@@ -957,7 +957,7 @@
               <w:rPr>
                 <w:sz w:val="18"/>
               </w:rPr>
-              <w:t>When the king’s order had been publicly posted, many young girls were brought to the palace complex of Susa and given over to Hegai who was overseer of the women. Esther was among them.</w:t>
+              <w:t>Now there was a Jew who lived in the palace complex in Susa. His name was Mordecai the son of Jair, the son of Shimei, the son of Kish—a Benjaminite. His ancestors had been taken from Jerusalem with the exiles and carried off with King Jehoiachin of Judah by King Nebuchadnezzar of Babylon into exile. Mordecai had raised his cousin Hadassah, otherwise known as Esther, since she had no father or mother. The girl had a good figure and a beautiful face. After her parents died, Mordecai had adopted her.</w:t>
             </w:r>
           </w:p>
         </w:tc>
@@ -972,7 +972,7 @@
                 <w:b/>
                 <w:sz w:val="16"/>
               </w:rPr>
-              <w:t>8</w:t>
+              <w:t>5-7</w:t>
             </w:r>
           </w:p>
           <w:p>
@@ -980,7 +980,7 @@
               <w:rPr>
                 <w:sz w:val="18"/>
               </w:rPr>
-              <w:t>When the king's new rule went public, a ton of young women were brought to the palace in Susa and handed over to Hegai. Esther was one of them.</w:t>
+              <w:t>Now, there was this Jewish guy named Mordecai living in the palace complex in Susa. He was Mordecai son of Jair, son of Shimei, son of Kish—a Benjaminite. His ancestors had been taken from Jerusalem into exile along with King Jehoiachin of Judah when King Nebuchadnezzar of Babylon carried them off. Mordecai had raised his cousin, Hadassah, who everyone called Esther, because she had no father or mother. She had a great figure and a beautiful face. After her parents died, Mordecai adopted her.</w:t>
             </w:r>
           </w:p>
         </w:tc>
@@ -995,7 +995,7 @@
                 <w:b/>
                 <w:sz w:val="16"/>
               </w:rPr>
-              <w:t>8</w:t>
+              <w:t>5-7</w:t>
             </w:r>
           </w:p>
           <w:p>
@@ -1003,7 +1003,7 @@
               <w:rPr>
                 <w:sz w:val="18"/>
               </w:rPr>
-              <w:t>왕의 명령이 전국에 알려지자, 수많은 젊은 여자들이 수사 궁으로 와서 여자들을 책임지는 헤개에게 보내졌는데, 에스더도 그중에 있었어.</w:t>
+              <w:t>그때 수사 궁에 모르드개라는 유대인이 살고 있었는데, 이 사람은 야일의 아들, 시므이의 아들, 기스의 아들로 베냐민 지파 소속이었음. 조상들은 여호야긴 왕 때 느부갓네살 왕에 의해 예루살렘에서 바빌론으로 잡혀간 사람들이었어. 모르드개는 부모님이 안 계신 사촌 동생 하닷사, 다른 이름으로는 에스더를 딸처럼 키웠대. 에스더는 몸매도 좋고 얼굴도 진짜 예뻤던 거임. 부모님이 돌아가신 후에 모르드개가 입양한 거지.</w:t>
             </w:r>
           </w:p>
         </w:tc>
@@ -1020,7 +1020,7 @@
                 <w:b/>
                 <w:sz w:val="16"/>
               </w:rPr>
-              <w:t>9-10</w:t>
+              <w:t>8</w:t>
             </w:r>
           </w:p>
           <w:p>
@@ -1028,7 +1028,7 @@
               <w:rPr>
                 <w:sz w:val="18"/>
               </w:rPr>
-              <w:t>Hegai liked Esther and took a special interest in her. Right off he started her beauty treatments, ordered special food, assigned her seven personal maids from the palace, and put her and her maids in the best rooms in the harem. Esther didn’t say anything about her family and racial background because Mordecai had told her not to.</w:t>
+              <w:t>When the king’s order had been publicly posted, many young girls were brought to the palace complex of Susa and given over to Hegai who was overseer of the women. Esther was among them.</w:t>
             </w:r>
           </w:p>
         </w:tc>
@@ -1043,7 +1043,7 @@
                 <w:b/>
                 <w:sz w:val="16"/>
               </w:rPr>
-              <w:t>9-10</w:t>
+              <w:t>8</w:t>
             </w:r>
           </w:p>
           <w:p>
@@ -1051,7 +1051,7 @@
               <w:rPr>
                 <w:sz w:val="18"/>
               </w:rPr>
-              <w:t>Hegai thought Esther was awesome and took a real liking to her. He immediately started her on the best beauty treatments, got her special food, gave her seven personal maids from the palace, and put her and her maids in the best suite in the harem. But Esther kept her family and her Jewish background on the down-low, because Mordecai told her not to say anything.</w:t>
+              <w:t>When the king's new rule went public, a ton of young women were brought to the palace in Susa and handed over to Hegai. Esther was one of them.</w:t>
             </w:r>
           </w:p>
         </w:tc>
@@ -1066,7 +1066,7 @@
                 <w:b/>
                 <w:sz w:val="16"/>
               </w:rPr>
-              <w:t>9-10</w:t>
+              <w:t>8</w:t>
             </w:r>
           </w:p>
           <w:p>
@@ -1074,7 +1074,7 @@
               <w:rPr>
                 <w:sz w:val="18"/>
               </w:rPr>
-              <w:t>헤개는 에스더를 보자마자 맘에 들어서 특별히 챙겨줬대. 바로 뷰티 케어 시작해주고, 특별식도 챙겨주고, 궁에서 일하는 시녀 일곱 명도 붙여주고, 후궁에서 제일 좋은 방으로 배정해줬음. 근데 에스더는 모르드개가 말하지 말라고 해서 자기가 유대인이라는 거랑 가족에 대해서는 아무한테도 말 안 했대.</w:t>
+              <w:t>왕의 명령이 전국에 알려지자, 수많은 젊은 여자들이 수사 궁으로 와서 여자들을 책임지는 헤개에게 보내졌는데, 에스더도 그중에 있었어.</w:t>
             </w:r>
           </w:p>
         </w:tc>
@@ -1091,7 +1091,7 @@
                 <w:b/>
                 <w:sz w:val="16"/>
               </w:rPr>
-              <w:t>11</w:t>
+              <w:t>9-10</w:t>
             </w:r>
           </w:p>
           <w:p>
@@ -1099,7 +1099,7 @@
               <w:rPr>
                 <w:sz w:val="18"/>
               </w:rPr>
-              <w:t>Every day Mordecai strolled beside the court of the harem to find out how Esther was and get news of what she was doing.</w:t>
+              <w:t>Hegai liked Esther and took a special interest in her. Right off he started her beauty treatments, ordered special food, assigned her seven personal maids from the palace, and put her and her maids in the best rooms in the harem. Esther didn’t say anything about her family and racial background because Mordecai had told her not to.</w:t>
             </w:r>
           </w:p>
         </w:tc>
@@ -1114,7 +1114,7 @@
                 <w:b/>
                 <w:sz w:val="16"/>
               </w:rPr>
-              <w:t>11</w:t>
+              <w:t>9-10</w:t>
             </w:r>
           </w:p>
           <w:p>
@@ -1122,7 +1122,7 @@
               <w:rPr>
                 <w:sz w:val="18"/>
               </w:rPr>
-              <w:t>Every single day, Mordecai would walk by the harem courtyard to check in and see how Esther was doing and what was going on with her.</w:t>
+              <w:t>Hegai thought Esther was awesome and took a real liking to her. He immediately started her on the best beauty treatments, got her special food, gave her seven personal maids from the palace, and put her and her maids in the best suite in the harem. But Esther kept her family and her Jewish background on the down-low, because Mordecai told her not to say anything.</w:t>
             </w:r>
           </w:p>
         </w:tc>
@@ -1137,7 +1137,7 @@
                 <w:b/>
                 <w:sz w:val="16"/>
               </w:rPr>
-              <w:t>11</w:t>
+              <w:t>9-10</w:t>
             </w:r>
           </w:p>
           <w:p>
@@ -1145,7 +1145,7 @@
               <w:rPr>
                 <w:sz w:val="18"/>
               </w:rPr>
-              <w:t>모르드개는 매일 후궁 뜰 옆을 서성이면서 에스더가 잘 지내는지, 뭐하고 지내는지 소식을 들으려고 했어.</w:t>
+              <w:t>헤개는 에스더를 보자마자 맘에 들어서 특별히 챙겨줬대. 바로 뷰티 케어 시작해주고, 특별식도 챙겨주고, 궁에서 일하는 시녀 일곱 명도 붙여주고, 후궁에서 제일 좋은 방으로 배정해줬음. 근데 에스더는 모르드개가 말하지 말라고 해서 자기가 유대인이라는 거랑 가족에 대해서는 아무한테도 말 안 했대.</w:t>
             </w:r>
           </w:p>
         </w:tc>
@@ -1162,7 +1162,7 @@
                 <w:b/>
                 <w:sz w:val="16"/>
               </w:rPr>
-              <w:t>12-14</w:t>
+              <w:t>11</w:t>
             </w:r>
           </w:p>
           <w:p>
@@ -1170,7 +1170,7 @@
               <w:rPr>
                 <w:sz w:val="18"/>
               </w:rPr>
-              <w:t>Each girl’s turn came to go in to King Xerxes after she had completed the twelve months of prescribed beauty treatments—six months’ treatment with oil of myrrh followed by six months with perfumes and various cosmetics. When it was time for the girl to go to the king, she was given whatever she wanted to take with her when she left the harem for the king’s quarters. She would go there in the evening; in the morning she would return to a second harem overseen by Shaashgaz, the king’s eunuch in charge of the concubines. She never again went back to the king unless the king took a special liking to her and asked for her by name.</w:t>
+              <w:t>Every day Mordecai strolled beside the court of the harem to find out how Esther was and get news of what she was doing.</w:t>
             </w:r>
           </w:p>
         </w:tc>
@@ -1185,7 +1185,7 @@
                 <w:b/>
                 <w:sz w:val="16"/>
               </w:rPr>
-              <w:t>12-14</w:t>
+              <w:t>11</w:t>
             </w:r>
           </w:p>
           <w:p>
@@ -1193,7 +1193,7 @@
               <w:rPr>
                 <w:sz w:val="18"/>
               </w:rPr>
-              <w:t>Each girl had to go through twelve months of beauty prep before it was her turn to meet King Xerxes. It was six months of treatments with myrrh oil, and then six months with perfumes and other cosmetics. When a girl's time came to go to the king, she could take whatever she wanted with her from the harem. She'd go to his place in the evening and then in the morning, she'd move to a second harem, this one run by Shaashgaz, another one of the king's eunuchs who was in charge of the concubines. A girl would never see the king again unless he was super into her and specifically asked for her by name.</w:t>
+              <w:t>Every single day, Mordecai would walk by the harem courtyard to check in and see how Esther was doing and what was going on with her.</w:t>
             </w:r>
           </w:p>
         </w:tc>
@@ -1208,7 +1208,7 @@
                 <w:b/>
                 <w:sz w:val="16"/>
               </w:rPr>
-              <w:t>12-14</w:t>
+              <w:t>11</w:t>
             </w:r>
           </w:p>
           <w:p>
@@ -1216,7 +1216,7 @@
               <w:rPr>
                 <w:sz w:val="18"/>
               </w:rPr>
-              <w:t>여자들은 12달 동안 정해진 피부 관리 프로그램을 다 마쳐야 크세르크세스 왕한테 갈 수 있었는데, 처음 6개월은 몰약 기름으로, 다음 6개월은 향수랑 여러 화장품으로 관리를 받았대. 왕한테 갈 차례가 되면, 후궁에서 왕의 처소로 갈 때 원하는 건 뭐든지 가져갈 수 있었어. 저녁에 왕한테 갔다가 아침이 되면 후궁을 관리하는 또 다른 내시인 사아스가스가 책임지는 다른 후궁으로 돌아왔지. 왕이 특별히 그 여자를 마음에 들어 해서 이름을 부르지 않는 이상 다시는 왕을 볼 수 없었대.</w:t>
+              <w:t>모르드개는 매일 후궁 뜰 옆을 서성이면서 에스더가 잘 지내는지, 뭐하고 지내는지 소식을 들으려고 했어.</w:t>
             </w:r>
           </w:p>
         </w:tc>
@@ -1233,7 +1233,7 @@
                 <w:b/>
                 <w:sz w:val="16"/>
               </w:rPr>
-              <w:t>15</w:t>
+              <w:t>12-14</w:t>
             </w:r>
           </w:p>
           <w:p>
@@ -1241,7 +1241,7 @@
               <w:rPr>
                 <w:sz w:val="18"/>
               </w:rPr>
-              <w:t>When it was Esther’s turn to go to the king (Esther the daughter of Abihail the uncle of Mordecai, who had adopted her as his daughter), she asked for nothing other than what Hegai, the king’s eunuch in charge of the harem, had recommended. Esther, just as she was, won the admiration of everyone who saw her.</w:t>
+              <w:t>Each girl’s turn came to go in to King Xerxes after she had completed the twelve months of prescribed beauty treatments—six months’ treatment with oil of myrrh followed by six months with perfumes and various cosmetics. When it was time for the girl to go to the king, she was given whatever she wanted to take with her when she left the harem for the king’s quarters. She would go there in the evening; in the morning she would return to a second harem overseen by Shaashgaz, the king’s eunuch in charge of the concubines. She never again went back to the king unless the king took a special liking to her and asked for her by name.</w:t>
             </w:r>
           </w:p>
         </w:tc>
@@ -1256,7 +1256,7 @@
                 <w:b/>
                 <w:sz w:val="16"/>
               </w:rPr>
-              <w:t>15</w:t>
+              <w:t>12-14</w:t>
             </w:r>
           </w:p>
           <w:p>
@@ -1264,7 +1264,7 @@
               <w:rPr>
                 <w:sz w:val="18"/>
               </w:rPr>
-              <w:t>When it was Esther's turn to go see the king — Esther, the daughter of Abihail (Mordecai's uncle), whom Mordecai had adopted as his own daughter — she didn't ask for anything extra. She just went with what Hegai, the guy in charge of the harem, suggested. And just like that, Esther wowed everyone who saw her.</w:t>
+              <w:t>Each girl had to complete twelve months of beauty prep before her turn to meet King Xerxes. It was six months of treatments with myrrh oil, and then six months with perfumes and other cosmetics. When a girl's time came to go to the king, she could take whatever she wanted with her from the harem to the king's quarters. She'd go to his place in the evening and then in the morning, she'd move to a second harem, this one run by Shaashgaz, another one of the king's eunuchs who was in charge of the concubines. A girl would never see the king again unless he was super into her and specifically asked for her by name.</w:t>
             </w:r>
           </w:p>
         </w:tc>
@@ -1279,7 +1279,7 @@
                 <w:b/>
                 <w:sz w:val="16"/>
               </w:rPr>
-              <w:t>15</w:t>
+              <w:t>12-14</w:t>
             </w:r>
           </w:p>
           <w:p>
@@ -1287,7 +1287,7 @@
               <w:rPr>
                 <w:sz w:val="18"/>
               </w:rPr>
-              <w:t>모르드개의 삼촌 아비하일의 딸, 즉 모르드개가 딸처럼 키운 에스더가 왕에게 갈 차례가 되었을 때, 에스더는 후궁을 책임지는 내시 헤개가 추천해준 것 외에는 아무것도 요구하지 않았어. 있는 그대로의 에스더를 본 사람들은 모두 그녀에게 감탄했대.</w:t>
+              <w:t>여자들은 12달 동안 정해진 피부 관리를 다 마쳐야 크세르크세스 왕한테 갈 수 있었는데, 처음 6개월은 몰약 기름으로, 다음 6개월은 향수랑 여러 화장품으로 관리를 받았대. 왕한테 갈 차례가 되면, 후궁에서 왕의 처소로 갈 때 원하는 건 뭐든지 가져갈 수 있었어. 저녁에 왕한테 갔다가 아침이 되면 후궁을 관리하는 또 다른 내시인 사아스가스가 책임지는 두 번째 후궁으로 돌아왔지. 왕이 특별히 그 여자를 마음에 들어 해서 이름을 부르지 않는 이상 다시는 왕을 볼 수 없었대.</w:t>
             </w:r>
           </w:p>
         </w:tc>
@@ -1304,7 +1304,7 @@
                 <w:b/>
                 <w:sz w:val="16"/>
               </w:rPr>
-              <w:t>16</w:t>
+              <w:t>15</w:t>
             </w:r>
           </w:p>
           <w:p>
@@ -1312,7 +1312,7 @@
               <w:rPr>
                 <w:sz w:val="18"/>
               </w:rPr>
-              <w:t>She was taken to King Xerxes in the royal palace in the tenth month, the month of Tebeth, in the seventh year of the king’s reign.</w:t>
+              <w:t>When it was Esther’s turn to go to the king (Esther the daughter of Abihail the uncle of Mordecai, who had adopted her as his daughter), she asked for nothing other than what Hegai, the king’s eunuch in charge of the harem, had recommended. Esther, just as she was, won the admiration of everyone who saw her.</w:t>
             </w:r>
           </w:p>
         </w:tc>
@@ -1327,7 +1327,7 @@
                 <w:b/>
                 <w:sz w:val="16"/>
               </w:rPr>
-              <w:t>16</w:t>
+              <w:t>15</w:t>
             </w:r>
           </w:p>
           <w:p>
@@ -1335,7 +1335,7 @@
               <w:rPr>
                 <w:sz w:val="18"/>
               </w:rPr>
-              <w:t>She was taken to King Xerxes in his royal palace in the tenth month, the month of Tebeth, in the seventh year of his reign.</w:t>
+              <w:t>When it was Esther's turn to go to the king—Esther, the daughter of Abihail, Mordecai's uncle, who had adopted her as his daughter—she asked for nothing other than what Hegai, the king's eunuch in charge of the harem, recommended. And just like that, Esther, just as she was, wowed everyone who saw her.</w:t>
             </w:r>
           </w:p>
         </w:tc>
@@ -1350,7 +1350,7 @@
                 <w:b/>
                 <w:sz w:val="16"/>
               </w:rPr>
-              <w:t>16</w:t>
+              <w:t>15</w:t>
             </w:r>
           </w:p>
           <w:p>
@@ -1358,7 +1358,7 @@
               <w:rPr>
                 <w:sz w:val="18"/>
               </w:rPr>
-              <w:t>에스더는 왕의 통치 제7년 열째 달, 곧 데벳월에 크세르크세스 왕의 왕궁으로 불려갔어.</w:t>
+              <w:t>모르드개의 삼촌 아비하일의 딸, 즉 모르드개가 딸처럼 키운 에스더가 왕에게 갈 차례가 되었을 때, 에스더는 후궁을 책임지는 내시 헤개가 추천해준 것 외에는 아무것도 요구하지 않았어. 있는 그대로의 에스더를 본 사람들은 모두 그녀에게 감탄했대.</w:t>
             </w:r>
           </w:p>
         </w:tc>
@@ -1375,7 +1375,7 @@
                 <w:b/>
                 <w:sz w:val="16"/>
               </w:rPr>
-              <w:t>17-18</w:t>
+              <w:t>16</w:t>
             </w:r>
           </w:p>
           <w:p>
@@ -1383,7 +1383,7 @@
               <w:rPr>
                 <w:sz w:val="18"/>
               </w:rPr>
-              <w:t>The king fell in love with Esther far more than with any of his other women or any of the other virgins—he was totally smitten by her. He placed a royal crown on her head and made her queen in place of Vashti. Then the king gave a great banquet for all his nobles and officials—“Esther’s Banquet.” He proclaimed a holiday for all the provinces and handed out gifts with royal generosity.</w:t>
+              <w:t>She was taken to King Xerxes in the royal palace in the tenth month, the month of Tebeth, in the seventh year of the king’s reign.</w:t>
             </w:r>
           </w:p>
         </w:tc>
@@ -1398,7 +1398,7 @@
                 <w:b/>
                 <w:sz w:val="16"/>
               </w:rPr>
-              <w:t>17-18</w:t>
+              <w:t>16</w:t>
             </w:r>
           </w:p>
           <w:p>
@@ -1406,7 +1406,7 @@
               <w:rPr>
                 <w:sz w:val="18"/>
               </w:rPr>
-              <w:t>The king was head over heels for Esther, way more than any of the other women. He was completely smitten. He put a royal crown on her head and made her the new queen, replacing Vashti. Then the king threw a huge party for all his important officials, calling it “Esther’s Banquet.” He even declared a public holiday for the whole kingdom and gave out tons of generous gifts.</w:t>
+              <w:t>She was taken to King Xerxes in his royal palace in the tenth month, the month of Tebeth, in the seventh year of the king's reign.</w:t>
             </w:r>
           </w:p>
         </w:tc>
@@ -1421,7 +1421,7 @@
                 <w:b/>
                 <w:sz w:val="16"/>
               </w:rPr>
-              <w:t>17-18</w:t>
+              <w:t>16</w:t>
             </w:r>
           </w:p>
           <w:p>
@@ -1429,7 +1429,7 @@
               <w:rPr>
                 <w:sz w:val="18"/>
               </w:rPr>
-              <w:t>왕은 다른 어떤 여자들보다 에스더를 훨씬 더 사랑하게 됐고, 완전히 반해버린 거임. 왕은 에스더의 머리에 왕관을 씌워주고 와쉬티 대신 왕비로 삼았어. 그리고는 모든 귀족과 신하들을 위해 “에스더의 연회”라는 큰 잔치를 열었지. 모든 지방에 휴일을 선포하고 왕의 이름으로 푸짐하게 선물을 나눠줬대.</w:t>
+              <w:t>에스더는 왕의 통치 제7년 열째 달, 곧 데벳월에 크세르크세스 왕의 왕궁으로 불려갔어.</w:t>
             </w:r>
           </w:p>
         </w:tc>
@@ -1446,7 +1446,7 @@
                 <w:b/>
                 <w:sz w:val="16"/>
               </w:rPr>
-              <w:t>19-20</w:t>
+              <w:t>17-18</w:t>
             </w:r>
           </w:p>
           <w:p>
@@ -1454,7 +1454,7 @@
               <w:rPr>
                 <w:sz w:val="18"/>
               </w:rPr>
-              <w:t>On one of the occasions when the virgins were being gathered together, Mordecai was sitting at the King’s Gate. All this time, Esther had kept her family background and race a secret as Mordecai had ordered; Esther still did what Mordecai told her, just as when she was being raised by him.</w:t>
+              <w:t>The king fell in love with Esther far more than with any of his other women or any of the other virgins—he was totally smitten by her. He placed a royal crown on her head and made her queen in place of Vashti. Then the king gave a great banquet for all his nobles and officials—“Esther’s Banquet.” He proclaimed a holiday for all the provinces and handed out gifts with royal generosity.</w:t>
             </w:r>
           </w:p>
         </w:tc>
@@ -1469,7 +1469,7 @@
                 <w:b/>
                 <w:sz w:val="16"/>
               </w:rPr>
-              <w:t>19-20</w:t>
+              <w:t>17-18</w:t>
             </w:r>
           </w:p>
           <w:p>
@@ -1477,7 +1477,7 @@
               <w:rPr>
                 <w:sz w:val="18"/>
               </w:rPr>
-              <w:t>On one of the occasions when the virgins were being gathered together, Mordecai was just chilling at the King's Gate. The whole time, Esther had kept her family background a secret, just like Mordecai told her to. She still listened to him, just like when she was a kid.</w:t>
+              <w:t>The king was head over heels for Esther, way more than any of the other women. He was completely smitten. He put a royal crown on her head and made her the new queen, replacing Vashti. Then the king threw a huge party for all his nobles and officials, calling it “Esther’s Banquet.” He even declared a public holiday for the whole kingdom and gave out tons of generous gifts.</w:t>
             </w:r>
           </w:p>
         </w:tc>
@@ -1492,6 +1492,31 @@
                 <w:b/>
                 <w:sz w:val="16"/>
               </w:rPr>
+              <w:t>17-18</w:t>
+            </w:r>
+          </w:p>
+          <w:p>
+            <w:r>
+              <w:rPr>
+                <w:sz w:val="18"/>
+              </w:rPr>
+              <w:t>왕은 다른 어떤 여자들보다 에스더를 훨씬 더 사랑하게 됐고, 완전히 반해버린 거임. 왕은 에스더의 머리에 왕관을 씌워주고 와쉬티 대신 왕비로 삼았어. 그리고는 모든 귀족과 신하들을 위해 “에스더의 연회”라는 큰 잔치를 열었지. 모든 지방에 휴일을 선포하고 왕의 이름으로 푸짐하게 선물을 나눠줬대.</w:t>
+            </w:r>
+          </w:p>
+        </w:tc>
+      </w:tr>
+      <w:tr>
+        <w:tc>
+          <w:tcPr>
+            <w:tcW w:type="dxa" w:w="2880"/>
+          </w:tcPr>
+          <w:p>
+            <w:r/>
+            <w:r>
+              <w:rPr>
+                <w:b/>
+                <w:sz w:val="16"/>
+              </w:rPr>
               <w:t>19-20</w:t>
             </w:r>
           </w:p>
@@ -1500,7 +1525,53 @@
               <w:rPr>
                 <w:sz w:val="18"/>
               </w:rPr>
-              <w:t>처녀들을 다시 모으던 어느 날, 모르드개는 왕궁 문에 앉아 있었어. 에스더는 그동안 모르드개가 시킨 대로 자기 가족 배경과 민족에 대해 비밀로 하고 있었고, 어릴 때처럼 여전히 모르드개의 말을 잘 들었지.</w:t>
+              <w:t>On one of the occasions when the virgins were being gathered together, Mordecai was sitting at the King’s Gate. All this time, Esther had kept her family background and race a secret as Mordecai had ordered; Esther still did what Mordecai told her, just as when she was being raised by him.</w:t>
+            </w:r>
+          </w:p>
+        </w:tc>
+        <w:tc>
+          <w:tcPr>
+            <w:tcW w:type="dxa" w:w="2880"/>
+          </w:tcPr>
+          <w:p>
+            <w:r/>
+            <w:r>
+              <w:rPr>
+                <w:b/>
+                <w:sz w:val="16"/>
+              </w:rPr>
+              <w:t>19-20</w:t>
+            </w:r>
+          </w:p>
+          <w:p>
+            <w:r>
+              <w:rPr>
+                <w:sz w:val="18"/>
+              </w:rPr>
+              <w:t>On one of the occasions when the virgins were being gathered, Mordecai was just chilling at the King's Gate. The whole time, Esther had kept her family background and her race a secret, just like Mordecai told her to. She still listened to him, just like when she was a kid.</w:t>
+            </w:r>
+          </w:p>
+        </w:tc>
+        <w:tc>
+          <w:tcPr>
+            <w:tcW w:type="dxa" w:w="2880"/>
+          </w:tcPr>
+          <w:p>
+            <w:r/>
+            <w:r>
+              <w:rPr>
+                <w:b/>
+                <w:sz w:val="16"/>
+              </w:rPr>
+              <w:t>19-20</w:t>
+            </w:r>
+          </w:p>
+          <w:p>
+            <w:r>
+              <w:rPr>
+                <w:sz w:val="18"/>
+              </w:rPr>
+              <w:t>처녀들을 모으던 때 중 하루는, 모르드개가 왕궁 문에 앉아 있었어. 에스더는 그동안 모르드개가 시킨 대로 자기 가족 배경과 민족에 대해 비밀로 하고 있었고, 어릴 때처럼 여전히 모르드개의 말을 잘 들었지.</w:t>
             </w:r>
           </w:p>
         </w:tc>
@@ -1686,7 +1757,7 @@
               <w:rPr>
                 <w:sz w:val="18"/>
               </w:rPr>
-              <w:t>A little while later, King Xerxes gave a major promotion to this guy Haman, the son of Hammedatha the Agagite. He basically made him the second most powerful person in the whole government. All the king's staff at the main gate would bow down and kneel whenever Haman came by—that was the king's direct order.</w:t>
+              <w:t>A little while later, King Xerxes gave a major promotion to this guy Haman, the son of Hammedatha the Agagite. He basically made him the highest-ranking official in the whole government. All the king's staff at the main gate would bow down and kneel whenever Haman came by—that was the king's direct order.</w:t>
             </w:r>
           </w:p>
         </w:tc>
@@ -1709,7 +1780,7 @@
               <w:rPr>
                 <w:sz w:val="18"/>
               </w:rPr>
-              <w:t>얼마 뒤에 크세르크세스왕이 아각 사람 함므다다의 아들 하만을 승진시켜서, 정부에서 제일 높은 자리에 앉혔대. 왕궁 문에 있는 모든 신하들은 하만한테 엎드려 절해야 했어. 왕이 그렇게 명령했거든.</w:t>
+              <w:t>얼마 뒤에 크세르크세스 왕이 아각 사람 함므다다의 아들 하만을 승진시켜서, 정부에서 제일 높은 자리에 앉혔대. 왕궁 문에 있는 모든 신하들은 하만한테 엎드려 절해야 했어. 왕이 그렇게 명령했거든.</w:t>
             </w:r>
           </w:p>
         </w:tc>
@@ -1780,7 +1851,7 @@
               <w:rPr>
                 <w:sz w:val="18"/>
               </w:rPr>
-              <w:t>근데 모르드개는 절대 그렇게 안 하는 거임. 꿋꿋하게 절을 안 했대. 왕궁 문에 있던 신하들이 모르드개한테 물었지. "아니, 왜 왕의 명령을 어기는 거임?" 매일같이 뭐라 했는데도 모르드개는 귓등으로도 안 들었대. 그래서 걔네들이 하만한테 가서 일러바쳤어. 모르드개가 유대인이라는 사실도 말해줬지.</w:t>
+              <w:t>근데 모르드개는 절대 그렇게 안 하는 거임. 꿋꿋하게 절을 안 했대. 왕궁 문에 있던 신하들이 모르드개한테 물었지. "아니, 왜 왕의 명령을 어기는 거임?" 매일같이 뭐라 했는데도 모르드개는 귓등으로도 안 들었대. 그래서 걔네들이 하만한테 가서 알려줬어. 모르드개가 유대인이라는 사실도 말해줬지.</w:t>
             </w:r>
           </w:p>
         </w:tc>
@@ -1851,7 +1922,7 @@
               <w:rPr>
                 <w:sz w:val="18"/>
               </w:rPr>
-              <w:t>하만이 진짜로 모르드개가 자기한테 절 안 하는 걸 보고 완전 화난 거임. 근데 모르드개가 유대인이라는 걸 알고 나서는, 걔 하나만 혼내는 건 좀 아깝다고 생각했대. 그래서 아예 크세르크세스왕의 온 나라에 있는 유대인들을 싹 다 없애버릴 계획을 세운 거야.</w:t>
+              <w:t>하만이 진짜로 모르드개가 자기한테 절 안 하는 걸 보고 완전 화난 거임. 근데 모르드개가 유대인이라는 걸 알고 나서는, 한 유대인한테만 화내는 건 아깝다고 생각했대. 그래서 아예 크세르크세스 왕의 온 나라에 있는 유대인들을 싹 다 없애버릴 계획을 세운 거야.</w:t>
             </w:r>
           </w:p>
         </w:tc>
@@ -1922,7 +1993,7 @@
               <w:rPr>
                 <w:sz w:val="18"/>
               </w:rPr>
-              <w:t>크세르크세스왕 12년 첫째 달, 그러니까 니산월에 하만이 부르, 곧 제비를 뽑게 해서 날짜랑 달을 정했대. 제비를 뽑았더니 열두째 달, 아달월 십삼일이 나온 거임.</w:t>
+              <w:t>크세르크세스 왕 12년 첫째 달, 그러니까 니산월에 하만이 부르, 곧 제비를 뽑게 해서 날짜랑 달을 정했대. 제비를 뽑았더니 열두째 달, 아달월 십삼일이 나온 거임.</w:t>
             </w:r>
           </w:p>
         </w:tc>
@@ -1993,7 +2064,7 @@
               <w:rPr>
                 <w:sz w:val="18"/>
               </w:rPr>
-              <w:t>하만이 크세르크세스왕한테 가서 말했어. "왕이시여, 왕의 나라 곳곳에 흩어져 사는 이상한 민족이 있는데, 걔네는 다른 사람들이랑 어울리지를 못합니다. 걔네 법은 다른 모든 백성의 것과 달라서 왕의 법도 안 지킵니다. 왕께서 걔네를 그냥 두는 건 말이 안 됩니다. 괜찮으시다면 걔네를 다 죽이라는 명령을 내려주십시오. 제가 은 375톤을 왕의 금고에 내서 비용을 대겠습니다."</w:t>
+              <w:t>하만이 크세르크세스 왕한테 가서 말했어. "왕이시여, 왕의 나라 곳곳에 흩어져 사는 이상한 민족이 있는데, 걔네는 다른 사람들이랑 어울리지를 못합니다. 걔네 법은 다른 모든 백성의 것과 달라서 왕의 법도 안 지킵니다. 왕께서 걔네를 그냥 두는 건 말이 안 됩니다. 괜찮으시다면 걔네를 다 죽이라는 명령을 내려주십시오. 제가 은 375톤을 왕의 금고에 내서 비용을 대겠습니다."</w:t>
             </w:r>
           </w:p>
         </w:tc>
@@ -2041,7 +2112,7 @@
               <w:rPr>
                 <w:sz w:val="18"/>
               </w:rPr>
-              <w:t>The king just took off his special signet ring and handed it to Haman son of Hammedatha, the Agagite, the number one enemy of the Jews.</w:t>
+              <w:t>The king just took off his special signet ring and handed it to Haman son of Hammedatha the Agagite, the number one enemy of the Jews.</w:t>
             </w:r>
           </w:p>
         </w:tc>
@@ -2206,7 +2277,7 @@
               <w:rPr>
                 <w:sz w:val="18"/>
               </w:rPr>
-              <w:t>첫째 달 십삼일에 왕의 서기관들이 불려왔어. 하만이 왕의 총독들과 각 지방의 관리들과 각 민족의 귀족들에게 명령한 그대로 조서가 작성됐지. 각 지방의 글자와 각 민족의 언어로 크세르크세스왕의 이름으로 쓰이고 왕의 인장 반지로 도장이 찍혔어.</w:t>
+              <w:t>첫째 달 십삼일에 왕의 서기관들이 불려왔어. 하만이 왕의 총독들과 각 지방의 관리들과 각 민족의 귀족들에게 명령한 그대로 조서가 작성됐지. 각 지방의 글자와 각 민족의 언어로 크세르크세스 왕의 이름으로 쓰이고 왕의 인장 반지로 도장이 찍혔어.</w:t>
             </w:r>
           </w:p>
         </w:tc>
@@ -2254,7 +2325,7 @@
               <w:rPr>
                 <w:sz w:val="18"/>
               </w:rPr>
-              <w:t>Official bulletins were sent out by messengers to every province in the kingdom. The orders were to massacre, kill, and completely wipe out all the Jews—young, old, men, women, and children—on one single day: the thirteenth day of the twelfth month, Adar. And, they were allowed to take all their stuff. Copies of the order were posted in public in every province, so everyone could get ready for that day.</w:t>
+              <w:t>Bulletins were sent out by couriers to every province in the kingdom. The orders were to massacre, kill, and completely wipe out all the Jews—young, old, women, and children—on one single day: the thirteenth day of the twelfth month, Adar. And, they were allowed to take all their stuff. Copies of the bulletin were posted in public in every province, so everyone could get ready for that day.</w:t>
             </w:r>
           </w:p>
         </w:tc>
@@ -2277,7 +2348,7 @@
               <w:rPr>
                 <w:sz w:val="18"/>
               </w:rPr>
-              <w:t>그 조서는 왕의 모든 지방에 전달됐는데, 내용은 열두째 달, 곧 아달월 십삼일 하루 동안에 젊은이, 노인, 남자, 여자, 어린아이 할 것 없이 모든 유대인을 죽이고 학살하고 전멸시키고, 그들의 재산을 빼앗으라는 거였대. 이 조서의 사본은 각 지방에 법으로 공포되어서 모든 백성에게 알려졌고, 그날을 위해 준비하게 했지.</w:t>
+              <w:t>그 조서는 왕의 모든 지방에 전달됐는데, 내용은 열두째 달, 곧 아달월 십삼일 하루 동안에 젊은이, 노인, 여자, 어린아이 할 것 없이 모든 유대인을 죽이고 학살하고 전멸시키고, 그들의 재산을 빼앗으라는 거였대. 이 조서의 사본은 각 지방에 법으로 공포되어서 모든 백성에게 알려졌고, 그날을 위해 준비하게 했지.</w:t>
             </w:r>
           </w:p>
         </w:tc>
@@ -2486,7 +2557,7 @@
               <w:rPr>
                 <w:sz w:val="18"/>
               </w:rPr>
-              <w:t>모르드개가 이 모든 일을 알게 된 후에, 완전 화난 거임. 자기 옷을 막 찢고, 재를 뒤집어쓴 채로 베옷을 입었대. 그리고 성 안으로 들어가서 대성통곡을 하면서 울부짖었지. 근데 왕궁 문 앞까지밖에 못 갔어. 왜냐면 베옷 입은 사람은 왕궁 문으로 들어갈 수 없다는 규칙이 있었거든. 왕의 명령이 각 지방에 쫙 퍼지니까, 유다인들 사이에서 난리가 난 거야. 다들 금식하고 울고불고... 대부분은 베옷을 입고 재에 누워서 통곡했대.</w:t>
+              <w:t>모르드개가 이 모든 일을 알게 된 후에, 완전 화난 거임. 자기 옷을 막 찢고, 재를 뒤집어쓴 채로 베옷을 입었대. 그리고 성 안으로 들어가서 대성통곡을 하면서 울부짖었지. 근데 왕궁 문 앞까지밖에 못 갔어. 왜냐면 베옷 입은 사람은 왕궁 문으로 들어갈 수 없다는 룰이 있었거든. 왕의 명령이 각 지방에 쫙 퍼지니까, 유대인들 사이에서 난리가 난 거야. 다들 금식하고 울고불고... 대부분은 베옷을 입고 재에 누워서 통곡했대.</w:t>
             </w:r>
           </w:p>
         </w:tc>
@@ -2534,7 +2605,7 @@
               <w:rPr>
                 <w:sz w:val="18"/>
               </w:rPr>
-              <w:t>Esther’s maids and eunuchs came and told her what was up. The queen was shocked. She sent Mordecai some fresh clothes so he could change out of the burlap, but he was like, “Nah.” So Esther called for this guy Hathach, one of the king’s eunuchs assigned to her, and told him to go find out from Mordecai what was really going on. Hathach went to Mordecai in the town square right by the King’s Gate. Mordecai spilled everything that had happened to him. He even told him the exact amount of cash Haman had promised to pay the king to get all the Jews killed. Mordecai also gave him a copy of the official order for the massacre that was posted in Susa, so he could show it to Esther and tell her she had to go to the king and beg him to save her people.</w:t>
+              <w:t>Esther’s maids and personal assistants came and told her what was up. The queen was shocked. She sent Mordecai some fresh clothes so he could change out of the burlap, but he was like, “Nah.” So Esther called for this guy Hathach, one of the king's assistants assigned to her, and told him to go find out from Mordecai what was really going on. Hathach went to Mordecai in the town square right by the King’s Gate. Mordecai spilled everything that had happened to him. He even told him the exact amount of cash Haman had promised to pay the king to get all the Jews killed. Mordecai also gave him a copy of the official order for the massacre that was posted in Susa, so he could show it to Esther and tell her she had to go to the king and beg him to save her people.</w:t>
             </w:r>
           </w:p>
         </w:tc>
@@ -2557,7 +2628,7 @@
               <w:rPr>
                 <w:sz w:val="18"/>
               </w:rPr>
-              <w:t>에스더의 시녀들이랑 내시들이 와서 이 소식을 전해주니까 왕후가 완전 충격받은 거임. 그래서 모르드개한테 새 옷을 보내주면서 베옷 좀 벗으라고 했는데, 모르드개가 거절했대. 그래서 에스더가 왕이 자기한테 붙여준 내시 하닥을 불러서, 모르드개한테 가서 대체 무슨 일인지, 왜 저러는지 알아오라고 시켰어. 하닥이 왕궁 문 앞 성 안 광장에 있는 모르드개한테 갔지. 모르드개가 자기한테 일어난 모든 일을 다 말해줬대. 하만이 유다인들을 싹 다 죽이는 대가로 왕의 금고에 바치기로 약속한 은의 액수까지 정확하게 알려줬어. 그리고 수산에 공포된 유다인 말살 정책 조서 사본을 하닥한테 주면서, 에스더한테 보여주고 왕 앞에 나아가서 자기 민족을 위해 간절히 구해달라고 전하라고 했지.</w:t>
+              <w:t>에스더의 시녀들이랑 내시들이 와서 이 소식을 전해주니까 왕후가 완전 충격받은 거임. 그래서 모르드개한테 새 옷을 보내주면서 베옷 좀 벗으라고 했는데, 모르드개가 거절했대. 그래서 에스더가 왕이 자기한테 붙여준 내시 하닥을 불러서, 모르드개한테 가서 대체 무슨 일인지, 왜 저러는지 알아오라고 시켰어. 하닥이 왕궁 문 앞 성 안 광장에 있는 모르드개한테 갔지. 모르드개가 자기한테 일어난 모든 일을 다 말해줬대. 하만이 유대인들을 싹 다 죽이는 대가로 왕의 금고에 바치기로 약속한 은의 액수까지 정확하게 알려줬어. 그리고 수산에 공포된 유대인 말살 정책 조서 사본을 하닥한테 주면서, 에스더한테 보여주고 왕 앞에 나아가서 자기 민족을 위해 간절히 구해달라고 전하라고 했지.</w:t>
             </w:r>
           </w:p>
         </w:tc>
@@ -2605,7 +2676,7 @@
               <w:rPr>
                 <w:sz w:val="18"/>
               </w:rPr>
-              <w:t>Hathach went back and told Esther everything Mordecai said. Esther talked it over with Hathach and then sent him back to Mordecai with this message: “Look, everyone who works for the king, and even people out in the provinces, knows the deal. There’s a single rule for any man or woman who just shows up to the king without an invite: they die. The one exception is if the king holds out his golden scepter to them; then they get to live. And it’s been thirty days since I was last called to see the king.”</w:t>
+              <w:t>Hathach went back and told Esther everything Mordecai said. Esther talked it over with Hathach and then sent him back to Mordecai with this message: “Look, everyone who works for the king, and even people out in the provinces, knows the deal. There's a single rule for any man or woman who just shows up to the king without an invite: they die. The one exception is if the king holds out his gold scepter to them; then they get to live. And it's been thirty days now since I've been invited to come to the king.”</w:t>
             </w:r>
           </w:p>
         </w:tc>
@@ -2628,7 +2699,7 @@
               <w:rPr>
                 <w:sz w:val="18"/>
               </w:rPr>
-              <w:t>하닥이 돌아와서 모르드개가 한 말을 에스더한테 다 전해줬어. 에스더가 하닥이랑 얘기하더니, 다시 모르드개한테 이런 메시지를 보냈대. "왕을 모시는 모든 신하들이랑 각 지방 백성들까지 다 아는 사실이 있는데, 왕의 부름을 받지 않고 안뜰에 들어가서 왕을 만나러 가는 남녀는 무조건 사형이야. 딱 한 가지 예외는 왕이 그 사람한테 금 규를 내밀 때인데, 그래야만 살 수 있어. 근데 내가 왕한테 부름 받지 못한 지가 벌써 30일이나 됐어."</w:t>
+              <w:t>하닥이 돌아와서 모르드개가 한 말을 에스더한테 다 전해줬어. 에스더가 하닥이랑 얘기하더니, 다시 모르드개한테 이런 메시지를 보냈대. "왕을 모시는 모든 신하들이랑 각 지방 백성들까지 다 아는 사실이 있는데, 왕의 부름을 받지 않고 안뜰에 들어가서 왕을 만나러 가는 남녀는 무조건 사형이야. 딱 한 가지 예외는 왕이 그 사람한테 금 홀을 내밀 때인데, 그래야만 살 수 있어. 근데 내가 왕한테 부름 받지 못한 지가 벌써 30일이나 됐어."</w:t>
             </w:r>
           </w:p>
         </w:tc>
@@ -2676,7 +2747,7 @@
               <w:rPr>
                 <w:sz w:val="18"/>
               </w:rPr>
-              <w:t>When Hathach told Mordecai what Esther said, Mordecai sent this message back to her: “Don’t think for a second that just because you’re in the palace, you’re the one Jew who’s gonna make it out of this alive. If you stay quiet at a time like this, help will come for the Jews from somewhere else, but you and your whole family will be toast. Who knows? Maybe you were made queen for this exact moment.”</w:t>
+              <w:t>When Hathach told Mordecai what Esther said, Mordecai sent this message back to her: “Don’t think for a second that just because you’re in the palace, you’re the one Jew who’s gonna make it out of this alive. If you stay quiet at a time like this, help will come for the Jews from somewhere else, but you and your family will be wiped out. Who knows? Maybe you were made queen for this exact moment.”</w:t>
             </w:r>
           </w:p>
         </w:tc>
@@ -2699,7 +2770,7 @@
               <w:rPr>
                 <w:sz w:val="18"/>
               </w:rPr>
-              <w:t>하닥이 에스더의 말을 모르드개한테 전해주니까, 모르드개가 다시 이런 답장을 보냈대. "너 혼자 왕궁에 있다고 해서 모든 유다인들 중에서 너만 살아남을 거라고 착각하지 마. 만약 이 중요한 때에 네가 입 닫고 가만히 있으면, 유다인들을 위한 도움과 구원은 다른 데서라도 반드시 올 거야. 하지만 너랑 네 아빠 집안은 멸망할 거라고. 네가 왕후가 된 게 바로 지금 이 순간을 위한 게 아닐지 누가 알겠냐?"</w:t>
+              <w:t>하닥이 에스더의 말을 모르드개한테 전해주니까, 모르드개가 다시 이런 답장을 보냈대. "너 혼자 왕궁에 있다고 해서 모든 유대인들 중에서 너만 살아남을 거라고 착각하지 마. 만약 이 중요한 때에 네가 입 닫고 가만히 있으면, 유대인들을 위한 도움과 구원은 다른 데서라도 반드시 올 거야. 하지만 너랑 네 아빠 집안은 멸망할 거라고. 네가 왕후가 된 게 바로 지금 이 순간을 위한 게 아닐지 누가 알겠냐?"</w:t>
             </w:r>
           </w:p>
         </w:tc>
@@ -2770,7 +2841,7 @@
               <w:rPr>
                 <w:sz w:val="18"/>
               </w:rPr>
-              <w:t>에스더가 모르드개한테 다시 답장을 보냈어. "가서 수산에 있는 유다인들을 다 모아주세요. 그리고 저를 위해 금식해 주세요. 밤낮으로 3일 동안 아무것도 먹지도 마시지도 마세요. 저랑 제 시녀들도 함께 금식할게요. 그렇게 해주시면, 법을 어기는 거지만 제가 왕에게 나아갈게요. 그러다 죽으면, 죽는 거예요."</w:t>
+              <w:t>에스더가 모르드개한테 다시 답장을 보냈어. "가서 수산에 있는 유대인들을 다 모아주세요. 그리고 저를 위해 금식해 주세요. 밤낮으로 3일 동안 아무것도 먹지도 마시지도 마세요. 저랑 제 시녀들도 함께 금식할게요. 그렇게 해주시면, 법을 어기는 거지만 제가 왕에게 나아갈게요. 그러다 죽으면, 죽는 거예요."</w:t>
             </w:r>
           </w:p>
         </w:tc>
@@ -2979,7 +3050,7 @@
               <w:rPr>
                 <w:sz w:val="18"/>
               </w:rPr>
-              <w:t>3일 뒤에 에스더가 왕비 옷으로 쫙 빼입고 왕궁 안뜰, 그러니까 왕의 방 바로 앞에 서 있었대. 왕은 입구를 딱 마주보고 앉아 있었는데, 에스더 왕비가 뜰에 서 있는 걸 본 거임. 왕이 에스더를 보더니 기분이 좋았는지, 손에 있던 금 홀을 내밀었어. 에스더가 다가가서 그 홀 끝을 만졌지.</w:t>
+              <w:t>3일 뒤에 에스더가 왕비 옷으로 쫙 빼입고 왕궁 안뜰, 그러니까 왕의 방 바로 앞에 서 있었대. 왕은 입구를 딱 마주보고 앉아 있었는데, 에스더 왕비가 뜰에 서 있는 걸 본 거임. 왕이 에스더를 보더니 기분이 좋았는지, 손에 있던 금 홀을 쫙 내밀었어. 에스더가 다가가서 그 홀 끝을 만졌지.</w:t>
             </w:r>
           </w:p>
         </w:tc>
@@ -3027,7 +3098,7 @@
               <w:rPr>
                 <w:sz w:val="18"/>
               </w:rPr>
-              <w:t>The king asked, "What do you desire, Queen Esther? What do you want? Just ask, and you'll get it—even if it's half of my kingdom!"</w:t>
+              <w:t>The king asked, "And what's your desire, Queen Esther? What do you want? Just ask, and you'll get it—even if it's half of my kingdom!"</w:t>
             </w:r>
           </w:p>
         </w:tc>
@@ -3367,7 +3438,7 @@
               <w:rPr>
                 <w:sz w:val="18"/>
               </w:rPr>
-              <w:t>Haman left the palace that day happy, beaming. And then he saw Mordecai sitting at the King’s Gate ignoring him, oblivious to him. Haman was furious with Mordecai. But he held himself in and went on home. He got his friends together with his wife Zeresh and started bragging about how much money he had, his many sons, all the times the king had honored him, and his promotion to the highest position in the government. “On top of all that,” Haman continued, “Queen Esther invited me to a private dinner she gave for the king, just the three of us. And she’s invited me to another one tomorrow. But I can’t enjoy any of it when I see invited me to a private dinner she gave for the king, just the three of us. And she’s invited me to another one tomorrow. But I can’t enjoy any of it when I see Mordecai the Jew sitting at the King’s Gate.”</w:t>
+              <w:t>Haman left the palace that day happy, beaming. And then he saw Mordecai sitting at the King’s Gate ignoring him, oblivious to him. Haman was furious with Mordecai. But he held himself in and went on home. He got his friends together with his wife Zeresh and started bragging about how much money he had, his many sons, all the times the king had honored him, and his promotion to the highest position in the government. “On top of all that,” Haman continued, “Queen Esther invited me to a private dinner she gave for the king, just the three of us. And she’s invited me to another one tomorrow. But I can’t enjoy any of it when I see Mordecai the Jew sitting at the King’s Gate.”</w:t>
             </w:r>
           </w:p>
         </w:tc>
@@ -3390,7 +3461,7 @@
               <w:rPr>
                 <w:sz w:val="18"/>
               </w:rPr>
-              <w:t>Haman left the palace that day feeling super happy. But then he saw Mordecai at the King's Gate, who completely ignored him. Haman was seriously mad at Mordecai, but he kept his cool and went home. He gathered his friends and his wife Zeresh and started flexing about how rich he was, his many sons, all the honors the king had given him, and how he was promoted to the top job in the government. "And get this," Haman went on, "Queen Esther invited me to a private dinner with the king, just the three of us. And she invited me again tomorrow. But none of that matters when I see that guy Mordecai the Jew sitting at the King's Gate."</w:t>
+              <w:t>Haman left the palace that day feeling super happy. But then he saw Mordecai at the King's Gate, who completely ignored him. Haman was seriously mad at Mordecai, but he kept his cool and went home. He gathered his friends and his wife Zeresh and started bragging about how rich he was, his many sons, all the honors the king had given him, and how he was promoted to the top job in the government. "And get this," Haman went on, "Queen Esther invited me to a private dinner with the king, just the three of us. And she invited me again tomorrow. But none of that matters when I see that guy Mordecai the Jew sitting at the King's Gate."</w:t>
             </w:r>
           </w:p>
         </w:tc>
@@ -3492,7 +3563,7 @@
               <w:rPr>
                 <w:sz w:val="18"/>
               </w:rPr>
-              <w:t>그의 아내 세레스와 모든 친구들이 말했어. "75피트(약 23미터) 높이의 교수대를 세워요. 그리고 내일 아침 제일 먼저 왕한테 가서 모르드개를 거기에 매달라고 하세요. 그러고 나서 기분 좋게 왕이랑 저녁 식사하러 가요."</w:t>
+              <w:t>그의 아내 세레스와 모든 친구들이 말했어. "75피트 높이의 교수대를 세워요. 그리고 내일 아침 제일 먼저 왕한테 가서 모르드개를 거기에 매달라고 하세요. 그러고 나서 기분 좋게 왕이랑 저녁 식사하러 가요."</w:t>
             </w:r>
           </w:p>
         </w:tc>
@@ -3574,7 +3645,7 @@
         <w:pStyle w:val="Heading1"/>
       </w:pPr>
       <w:r>
-        <w:t>Chapter 6 — The King's Sleepless Night Leads to Haman's Humiliation</w:t>
+        <w:t>Chapter 6 — The King's Sleepless Night Leads to Haman's Downfall</w:t>
       </w:r>
     </w:p>
     <w:tbl>
@@ -3678,7 +3749,7 @@
               <w:rPr>
                 <w:sz w:val="18"/>
               </w:rPr>
-              <w:t>So that night, the king was tossing and turning and just could not sleep. He told his servants to bring the official records, like the kingdom's daily journal, and read it to him. They got to the part where Mordecai totally saved the day by exposing Bigthana and Teresh's plot to assassinate King Xerxes, those two eunuchs who were supposed to be guarding the entrance.</w:t>
+              <w:t>So that night, the king was tossing and turning and just could not sleep. He told his servants to bring the official records, like the kingdom's daily journal, and read it to him. They got to the part where Mordecai totally saved the day by exposing the plot of Bigthana and Teresh—the two eunuchs who guarded the entrance and had conspired to assassinate King Xerxes.</w:t>
             </w:r>
           </w:p>
         </w:tc>
@@ -3701,7 +3772,7 @@
               <w:rPr>
                 <w:sz w:val="18"/>
               </w:rPr>
-              <w:t>그날 밤에 왕이 잠을 못 자고 뒤척이는 거임. 그래서 신하들한테 궁궐 기록, 그러니까 그날그날 있었던 일 적어놓는 일지를 가져와서 읽어보라고 시켰대. 근데 딱 모르드개가 빅다나랑 데레스라는 내시 두 명이 왕 암살하려고 했던 음모를 까발려서 막았던 그 기록이 나온 거지.</w:t>
+              <w:t>그날 밤에 왕이 잠을 못 자고 뒤척이는 거임. 그래서 신하들한테 궁궐 기록, 그러니까 그날그날 있었던 일 적어놓는 일지를 가져와서 읽어보라고 시켰대. 근데 딱 모르드개가 빅다나랑 데레스라는 내시 두 명이 크세르크세스 왕을 암살하려고 했던 음모를 까발려서 막았던 그 기록이 나온 거지.</w:t>
             </w:r>
           </w:p>
         </w:tc>
@@ -4278,7 +4349,7 @@
               <w:rPr>
                 <w:sz w:val="18"/>
               </w:rPr>
-              <w:t>Haman's thinking to himself, "He's talking about me! Who else could it be?!" So he goes all out and says, "For the guy the king wants to honor, you should totally do this: Get a royal robe the king himself has worn, and a horse the king has ridden, one with a royal crown on its head. Then, have one of the most noble princes put the robe on the guy, lead him on the horse through the main city square, and shout, 'This is what happens when the king wants to honor someone!'"</w:t>
+              <w:t>Haman's thinking to himself, "He's talking about me! Who else could it be?" So he goes all out and says, "For the guy the king wants to honor, you should totally do this: Get a royal robe the king himself has worn, and a horse the king has ridden, one with a royal crown on its head. Then, have one of the king's most noble princes put the robe on the guy, lead him on the horse through the main city square, and shout, 'This is what happens when the king wants to honor someone!'"</w:t>
             </w:r>
           </w:p>
         </w:tc>
@@ -4301,7 +4372,7 @@
               <w:rPr>
                 <w:sz w:val="18"/>
               </w:rPr>
-              <w:t>하만은 속으로 '어? 이거 나 얘기잖아? 왕이 나 말고 또 누굴 이렇게 챙겨주겠어?'라고 생각한 거임. 그래서 신나서 이렇게 말했지. "왕이 진짜 명예를 높여주고 싶은 사람을 위해서는요, 왕이 입으셨던 왕의 옷을 가져오고, 왕이 타셨던 말, 머리에 왕관 장식이 있는 그 말을 데려오십시오. 그리고 왕의 가장 높은 신하 중 한 명한테 그 옷을 입히게 하고, 말을 태워서 도시 광장을 돌게 하세요. 그 앞에서 '왕이 명예를 높여주고 싶은 사람에게는 이렇게 해준다!'라고 외치게 하는 겁니다!"</w:t>
+              <w:t>하만은 속으로 '이거 내 얘기네? 왕이 나 말고 또 누굴 이렇게 챙겨주겠어?'라고 생각한 거임. 그래서 신나서 이렇게 말했지. "왕이 진짜 명예를 높여주고 싶은 사람을 위해서는요, 왕이 입으셨던 왕의 옷을 가져오고, 왕이 타셨던 말, 머리에 왕관 장식이 있는 그 말을 데려오십시오. 그리고 왕의 가장 높은 신하 중 한 명한테 그 옷을 입히게 하고, 말을 태워서 도시 광장을 돌게 하세요. 그 앞에서 '왕이 명예를 높여주고 싶은 사람에게는 이렇게 해준다!'라고 외치게 하는 겁니다!"</w:t>
             </w:r>
           </w:p>
         </w:tc>
@@ -4372,7 +4443,7 @@
               <w:rPr>
                 <w:sz w:val="18"/>
               </w:rPr>
-              <w:t>왕이 하만한테 말했어. "좋은 생각이다. 당장 가서 그렇게 해라. 지체하지 말고, 네가 말한 대로 왕의 옷과 말을 가져다가 왕의 문에 앉아있는 유다인 모르드개에게 네가 제안한 그대로 다 해줘라. 하나도 빼먹지 말고."</w:t>
+              <w:t>왕이 하만한테 말했어. "좋은 생각이다. 당장 가서 그렇게 해라. 지체하지 말고, 네가 말한 대로 왕의 옷과 말을 가져다가 왕의 문에 앉아있는 유대인 모르드개에게 네가 제안한 그대로 다 해줘라. 하나도 빼먹지 말고."</w:t>
             </w:r>
           </w:p>
         </w:tc>
@@ -4491,7 +4562,7 @@
               <w:rPr>
                 <w:sz w:val="18"/>
               </w:rPr>
-              <w:t>After the parade, Mordecai just went back to his post at the King's Gate like it was no big deal. But Haman? He sprinted home, completely mortified, hiding his face in shame. He told his wife Zeresh and all his friends what happened, and they were like, "Dude, if this Mordecai guy is a Jew, you're toast. Your bad luck is just getting started. You have zero chance against him—you're basically ruined."</w:t>
+              <w:t>After the parade, Mordecai just went back to his post at the King's Gate like it was no big deal. But Haman? He sprinted home, completely mortified, hiding his face in shame. He told his wife Zeresh and all his friends everything that had happened, and his knowledgeable friends and his wife Zeresh were like, "Dude, if this Mordecai guy is in fact a Jew, you're finished. Your bad luck is just getting started. You have zero chance against him—you're basically ruined."</w:t>
             </w:r>
           </w:p>
         </w:tc>
@@ -4514,7 +4585,7 @@
               <w:rPr>
                 <w:sz w:val="18"/>
               </w:rPr>
-              <w:t>그렇게 퍼레이드 끝나고 모르드개는 다시 왕의 문으로 돌아갔는데, 하만은 너무 창피해서 얼굴도 못 들고 자기 집으로 도망쳤대. 집에 가서 아내 세레스랑 친구들한테 오늘 있었던 일 다 얘기해주니까, 그의 똑똑한 친구들이랑 아내가 말하는 거야. "만약 이 모르드개가 진짜 유다인이면, 당신의 불운은 이제 시작일 뿐이야. 그 사람한테 절대 못 이겨. 당신은 그냥 망한 거나 다름없어."</w:t>
+              <w:t>그렇게 퍼레이드 끝나고 모르드개는 다시 왕의 문으로 돌아갔는데, 하만은 완전 창피해서 얼굴도 못 들고 자기 집으로 도망쳤대. 집에 가서 아내 세레스랑 친구들한테 오늘 있었던 일 다 얘기해주니까, 그의 똑똑한 친구들이랑 아내가 말하는 거야. "만약 이 모르드개가 진짜 유대인이면, 당신의 불운은 이제 시작일 뿐이야. 그 사람한테 절대 못 이겨. 당신은 그냥 망한 거나 다름없어."</w:t>
             </w:r>
           </w:p>
         </w:tc>
@@ -5063,7 +5134,7 @@
               <w:rPr>
                 <w:sz w:val="18"/>
               </w:rPr>
-              <w:t>Haman was terrified, standing there in front of the king and queen.</w:t>
+              <w:t>Haman was shocked, standing there in front of the king and queen.</w:t>
             </w:r>
           </w:p>
         </w:tc>
@@ -5292,7 +5363,7 @@
               <w:rPr>
                 <w:sz w:val="18"/>
               </w:rPr>
-              <w:t>The second the king said that, the servants covered Haman's face.</w:t>
+              <w:t>The second the king said that, Haman went pale.</w:t>
             </w:r>
           </w:p>
         </w:tc>
@@ -5315,7 +5386,7 @@
               <w:rPr>
                 <w:sz w:val="18"/>
               </w:rPr>
-              <w:t>그 말이 떨어지자마자, 신하들이 하만의 얼굴을 가려버렸대.</w:t>
+              <w:t>그 말이 왕의 입에서 나오자마자, 하만의 얼굴에서 핏기가 싹 가셨대.</w:t>
             </w:r>
           </w:p>
         </w:tc>
@@ -5651,7 +5722,7 @@
               <w:rPr>
                 <w:sz w:val="18"/>
               </w:rPr>
-              <w:t>On the very same day, King Xerxes handed over all of Haman's property to Queen Esther—you know, the guy who was the biggest hater of the Jewish people. And then Mordecai got to come before the king, because Esther finally told him that they were family. The king took off his special signet ring, the one he'd taken back from Haman, and gave it straight to Mordecai. To top it off, Esther put Mordecai in charge of Haman's entire estate. What a rise to power!</w:t>
+              <w:t>On the very same day, King Xerxes handed over all of Haman's property to Queen Esther—you know, Haman, the archenemy of the Jewish people. And then Mordecai got to come before the king, because Esther finally told him that they were family. The king took off his special signet ring, the one he'd taken back from Haman, and gave it straight to Mordecai. To top it off, Esther put Mordecai in charge of Haman's entire estate. Talk about a major glow-up.</w:t>
             </w:r>
           </w:p>
         </w:tc>
@@ -5722,7 +5793,7 @@
               <w:rPr>
                 <w:sz w:val="18"/>
               </w:rPr>
-              <w:t>But Esther wasn't finished. She went back to the king, fell at his feet, and was literally in tears, begging him to undo the evil of Haman the Agagite and cancel his plan to destroy the Jews. The king held out his golden scepter to her, so she stood up and said, “Look, if you’re cool with it, and if you actually care about me and think this is the right thing to do, please, can you send out an official order to cancel the bulletins authorizing the plan of Haman son of Hammedatha the Agagite to annihilate the Jews everywhere? I seriously can't handle watching my people get wiped out. How can I just stand by and see my own relatives get massacred?”</w:t>
+              <w:t>But Esther wasn't finished. She went back to the king, fell at his feet, and was literally in tears, begging him to undo the evil plan Haman the Agagite had cooked up to destroy the Jews. The king held out his golden scepter to her, so she stood up and said, “Look, if you’re cool with it, and if you actually care about me and think this is the right thing to do, please, can you send out an official order to cancel the bulletins authorizing the plan of Haman son of Hammedatha the Agagite to annihilate the Jews in all the king's provinces? I seriously can't handle watching my people get wiped out. How can I just stand by and see my own relatives get massacred?”</w:t>
             </w:r>
           </w:p>
         </w:tc>
@@ -5745,7 +5816,7 @@
               <w:rPr>
                 <w:sz w:val="18"/>
               </w:rPr>
-              <w:t>근데 에스더는 이게 끝이 아니었음. 다시 왕한테 가서 발 앞에 엎드려서, 하만이 유대인들 없애려고 짰던 그 악랄한 계획 좀 제발 막아달라고 눈물로 빌었대. 왕이 에스더한테 금 홀을 내미니까, 에스더가 일어나서 왕 앞에 서서 말했음. "왕이 괜찮으시다면, 그리고 저를 좋게 보시고 이게 옳다고 생각하시면, 그리고 저를 조금이라도 아끼신다면, 하만이 왕의 모든 지방에 있는 유대인들을 다 죽이려고 보낸 공문을 취소하는 명령을 제발 내려주세요. 제 민족이 이런 끔찍한 재앙으로 사라지는 걸 어떻게 봐요? 제 친척들이 학살당하는 걸 어떻게 가만히 서서 보냐고요?"</w:t>
+              <w:t>근데 에스더는 이게 끝이 아니었음. 다시 왕한테 가서 발 앞에 엎드려서, 아각 사람 하만이 유대인들 없애려고 짰던 그 악랄한 계획 좀 제발 막아달라고 눈물로 빌었대. 왕이 에스더한테 금 홀을 내미니까, 에스더가 일어나서 왕 앞에 서서 말했음. "왕이 괜찮으시다면, 그리고 저를 좋게 보시고 이게 옳다고 생각하시면, 그리고 저를 조금이라도 아끼신다면, 아각 사람 함므다다의 아들 하만이 왕의 모든 지방에 있는 유대인들을 다 죽이려고 보낸 공문을 취소하는 명령을 제발 내려주세요. 제 민족이 이런 끔찍한 재앙으로 사라지는 걸 어떻게 봐요? 제 친척들이 학살당하는 걸 어떻게 가만히 서서 보냐고요?"</w:t>
             </w:r>
           </w:p>
         </w:tc>
@@ -5935,7 +6006,7 @@
               <w:rPr>
                 <w:sz w:val="18"/>
               </w:rPr>
-              <w:t>He wrote it all under King Xerxes' name and sealed it with the royal signet ring. Then he sent out the official notices by messengers on super-fast horses, the best of the best from the king's own stables.</w:t>
+              <w:t>He wrote it all under King Xerxes' name and sealed it with the royal signet ring. Then he sent out the bulletins by messengers on super-fast horses, the best of the best from the king's own stables.</w:t>
             </w:r>
           </w:p>
         </w:tc>
@@ -6006,7 +6077,7 @@
               <w:rPr>
                 <w:sz w:val="18"/>
               </w:rPr>
-              <w:t>The king's new order gave the Jews in every city the green light to arm themselves and fight back to the death. They could kill anyone who threatened them or their wives and children, and take for themselves anything owned by their enemies. The day set for this in all King Xerxes' provinces was the 13th day of the twelfth month, Adar. The order was posted publicly in every province so everyone knew what was up, and the Jews could get ready to get even with their enemies.</w:t>
+              <w:t>The king's new order gave the Jews in every city the green light to arm themselves and fight back. They could defend themselves to the death, kill anyone who threatened them, their women, or their children, and they could even take all the stuff their enemies owned. The day set for this in all King Xerxes' provinces was the thirteenth day of the twelfth month, the month of Adar. The order was posted publicly in every province so everyone knew what was up, and the Jews could get ready to get their revenge on their enemies.</w:t>
             </w:r>
           </w:p>
         </w:tc>
@@ -6029,7 +6100,7 @@
               <w:rPr>
                 <w:sz w:val="18"/>
               </w:rPr>
-              <w:t>왕의 명령은 모든 도시에 있는 유대인들이 무장하고 스스로를 지킬 수 있게 허락하는 거였음. 자신들이나 자기 아내와 자녀를 위협하는 자는 죽이고, 원수들의 소유물은 전리품으로 가져가도 된다는 내용이었지. 이 날은 크세르크세스 왕의 모든 지방에서 열두째 달, 즉 아달월 13일로 정해졌음. 이 명령은 모든 지방에 공개적으로 붙어서 모두가 읽을 수 있게 했고, 유대인들이 그날 적들에게 복수할 준비를 할 수 있도록 했대.</w:t>
+              <w:t>왕의 명령은 모든 도시에 있는 유대인들이 무장하고 스스로를 지킬 수 있게 허락하는 거였음. 자기들이나 자기 아내, 자식들을 위협하는 사람들은 누구든지 죽여도 되고, 그 적들의 재산은 뺏어도 된다는 내용이었지. 이 날은 크세르크세스 왕의 모든 지방에서 열두째 달, 즉 아달월 13일로 정해졌음. 이 명령은 모든 지방에 공개적으로 붙어서 모두가 읽을 수 있게 했고, 유대인들이 그날 적들에게 복수할 준비를 할 수 있도록 했대.</w:t>
             </w:r>
           </w:p>
         </w:tc>
@@ -6148,7 +6219,7 @@
               <w:rPr>
                 <w:sz w:val="18"/>
               </w:rPr>
-              <w:t>Mordecai walked out of the king's presence looking magnificent in a royal robe of violet and white, a massive gold crown, and a fancy purple cape. The whole city of Susa just erupted with joy. For the Jews, it was a time for celebration, laughter, and being honored. It was like that everywhere, in every province and city where the king's order was announced. The Jews were partying in the streets, cheering and feasting. And get this—a lot of non-Jews even converted and became Jews, because suddenly it was pretty dangerous *not* to be one.</w:t>
+              <w:t>Mordecai walked out of the king's presence looking magnificent in a royal robe of violet and white, a massive gold crown, and a purple cape of fine linen. The whole city of Susa just erupted with joy. For the Jews, it was a time for celebration, laughter, and being honored. It was like that everywhere, in every province and city where the king's order was announced. The Jews were partying in the streets, cheering and feasting. And get this—a lot of non-Jews even converted and became Jews, because suddenly it was pretty dangerous *not* to be one.</w:t>
             </w:r>
           </w:p>
         </w:tc>
@@ -6357,7 +6428,7 @@
               <w:rPr>
                 <w:sz w:val="18"/>
               </w:rPr>
-              <w:t>The Jews gathered in their cities all over King Xerxes' kingdom to take down anyone who was trying to ruin them. Literally no one could stand up to them—they were all shook. On top of that, all the government officials, the satraps, the governors—basically everyone working for the king—were quietly helping the Jews because they were scared of Mordecai. By this point, Mordecai was a major player in the palace, and his reputation was growing everywhere.</w:t>
+              <w:t>The Jews gathered in their cities all over King Xerxes' kingdom to take down anyone who was trying to ruin them. Literally no one could stand up to them—fear made cowards of them all. On top of that, all the government officials, the satraps, the governors—basically everyone working for the king—were quietly helping the Jews because they were scared of Mordecai. By this point, Mordecai was a major player in the palace, and his reputation was growing everywhere.</w:t>
             </w:r>
           </w:p>
         </w:tc>
@@ -6476,7 +6547,7 @@
               <w:rPr>
                 <w:sz w:val="18"/>
               </w:rPr>
-              <w:t>So, the Jews absolutely wrecked their enemies with swords, just a complete slaughter, and did whatever they wanted to the people who hated them. In the capital city of Susa, the Jews took out five hundred men. They also killed the ten sons of Haman son of Hammedatha, the Jews' number one hater: Parshandatha, Dalphon, Aspatha, Poratha, Adalia, Aridatha, Parmashta, Arisai, Aridai, and Vaizatha.</w:t>
+              <w:t>So, the Jews absolutely wrecked their enemies with swords, just a complete slaughter, and did whatever they wanted to the people who hated them. In the capital city of Susa, the Jews took out five hundred men. They also killed the ten sons of Haman son of Hammedatha, the archenemy of the Jews: Parshandatha, Dalphon, Aspatha, Poratha, Adalia, Aridatha, Parmashta, Arisai, Aridai, and Vaizatha.</w:t>
             </w:r>
           </w:p>
         </w:tc>
@@ -7186,7 +7257,7 @@
               <w:rPr>
                 <w:sz w:val="18"/>
               </w:rPr>
-              <w:t>Then Queen Esther—Abihail's daughter—and Mordecai the Jew put their full authority behind a second letter about Purim to make it official. They sent letters to all the Jews in all 127 provinces of Xerxes' kingdom, with words of peace and truth, locking in these days of Purim on the dates Mordecai had set — dates they had agreed on for themselves and their descendants, along with the fasting and mourning they had taken on. Esther's decree sealed the deal, and the whole thing was written down in the records.</w:t>
+              <w:t>Then Queen Esther—Abihail's daughter—and Mordecai the Jew put their full authority behind a second letter about Purim to make it official. They sent letters to all the Jews in all 127 provinces of Xerxes' kingdom, with words of peace and truth, locking in these days of Purim on the exact dates set by Mordecai the Jew—dates they had agreed to for themselves and their descendants regarding their fasting and mourning. Esther's decree sealed the deal, and the whole thing was written down in the records.</w:t>
             </w:r>
           </w:p>
         </w:tc>
@@ -7209,7 +7280,7 @@
               <w:rPr>
                 <w:sz w:val="18"/>
               </w:rPr>
-              <w:t>아비하일의 딸인 에스더 왕비가 유대인 모르드개와 함께 이 두 번째 부림절 편지에 둘의 모든 권한을 사용해서 이 편지의 내용을 확증하고 지지했음. 크세르크세스 왕국의 127개 지방에 있는 모든 유대인들에게 평화와 진실의 말이 담긴 편지가 보내져서, 이 부림절을 정해진 날짜에 지키도록 확정했대. 이건 유대인 모르드개가 정한 날짜였고, 자기들과 후손들이 금식하고 슬퍼하며 부르짖었던 것에 대해 스스로 정한 것이었음. 에스더의 말이 부림절의 관습을 확정했고, 그 내용은 책에 기록되었대.</w:t>
+              <w:t>아비하일의 딸인 에스더 왕비가 유대인 모르드개와 함께 이 두 번째 부림절 편지에 왕비의 모든 권한을 사용해서 그가 쓴 내용을 확증하고 지지했음. 크세르크세스 왕국의 127개 지방에 있는 모든 유대인들에게 평화와 진실의 말이 담긴 편지가 보내져서, 이 부림절을 정해진 날짜에 지키도록 확정했대. 이건 유대인 모르드개가 정한 날짜였고, 자기들과 후손들이 금식하고 슬퍼하며 부르짖었던 것에 대해 스스로 정한 것이었음. 에스더의 말이 부림절의 관습을 확정했고, 그 내용은 책에 기록되었대.</w:t>
             </w:r>
           </w:p>
         </w:tc>
@@ -7220,7 +7291,7 @@
         <w:pStyle w:val="Heading1"/>
       </w:pPr>
       <w:r>
-        <w:t>Chapter 10 — Mordecai's Epic Glow-Up</w:t>
+        <w:t>Chapter 10 — Mordecai's Epic Rise</w:t>
       </w:r>
     </w:p>
     <w:tbl>
@@ -7324,7 +7395,7 @@
               <w:rPr>
                 <w:sz w:val="18"/>
               </w:rPr>
-              <w:t>King Xerxes was basically taxing his entire empire, from one end to the other. And all the other stuff about his reign, like all his big achievements and the full story of Mordecai's glow-up after the king promoted him—it's all written down in the official history books of the kings of Media and Persia.</w:t>
+              <w:t>King Xerxes was basically taxing his entire empire, from one end to the other. And all the other stuff about his reign, like all his big achievements and the full story of Mordecai's rise after the king promoted him—it's all written down in *The Chronicles of the Kings of Media and Persia.*</w:t>
             </w:r>
           </w:p>
         </w:tc>
@@ -7347,7 +7418,7 @@
               <w:rPr>
                 <w:sz w:val="18"/>
               </w:rPr>
-              <w:t>크세르크세스 왕이 나라 끝에서 끝까지 세금을 쫙 걷었대. 그리고 크세르크세스 왕이 이룬 나머지 대단한 업적들이랑, 왕이 팍팍 밀어준 모르드개가 얼마나 대단했는지에 대한 자세한 이야기는, 메대랑 페르시아 왕들의 역사책에 다 기록되어 있대.</w:t>
+              <w:t>크세르크세스 왕이 나라 끝에서 끝까지 세금을 쫙 걷었대. 그리고 크세르크세스 왕이 이룬 나머지 대단한 업적들이랑, 왕이 팍팍 밀어준 모르드개가 얼마나 대단했는지에 대한 자세한 이야기는, 메대와 바사 왕들의 역대기에 다 기록되어 있대.</w:t>
             </w:r>
           </w:p>
         </w:tc>
@@ -7418,7 +7489,7 @@
               <w:rPr>
                 <w:sz w:val="18"/>
               </w:rPr>
-              <w:t>유다 사람 모르드개는 크세르크세스 왕 바로 다음인 2인자였던 거임. 유다 사람들한테 아주 인기가 많았고, 다들 엄청 존경했대. 그는 자기 민족이 잘 되게 하려고 진짜 열심히 일했고, 그들이 평화롭게 잘 살 수 있도록 항상 돌봐줬다더라고.</w:t>
+              <w:t>유대인 모르드개는 크세르크세스 왕 바로 다음인 2인자였던 거임. 유대 사람들 사이에서 완전 인기가 많았고, 다들 엄청 존경했대. 그는 자기 민족이 잘 되게 하려고 진짜 열심히 일했고, 그들이 평화롭게 잘 살 수 있도록 항상 돌봐줬다더라고.</w:t>
             </w:r>
           </w:p>
         </w:tc>

</xml_diff>

<commit_message>
Esther 배지 정밀화 (OT 전수조사): 6곳 (EN+KO) — 중복 범위 문단별 절화. 독스 10/10 export-back OK.
</commit_message>
<xml_diff>
--- a/gdocs_build/Esther.docx
+++ b/gdocs_build/Esther.docx
@@ -93,7 +93,7 @@
                 <w:b/>
                 <w:sz w:val="16"/>
               </w:rPr>
-              <w:t>1-3</w:t>
+              <w:t>1-2</w:t>
             </w:r>
           </w:p>
           <w:p>
@@ -116,7 +116,7 @@
                 <w:b/>
                 <w:sz w:val="16"/>
               </w:rPr>
-              <w:t>1-3</w:t>
+              <w:t>1-2</w:t>
             </w:r>
           </w:p>
           <w:p>
@@ -139,7 +139,7 @@
                 <w:b/>
                 <w:sz w:val="16"/>
               </w:rPr>
-              <w:t>1-3</w:t>
+              <w:t>1-2</w:t>
             </w:r>
           </w:p>
           <w:p>
@@ -164,7 +164,7 @@
                 <w:b/>
                 <w:sz w:val="16"/>
               </w:rPr>
-              <w:t>1-3</w:t>
+              <w:t>3</w:t>
             </w:r>
           </w:p>
           <w:p>
@@ -187,7 +187,7 @@
                 <w:b/>
                 <w:sz w:val="16"/>
               </w:rPr>
-              <w:t>1-3</w:t>
+              <w:t>3</w:t>
             </w:r>
           </w:p>
           <w:p>
@@ -210,7 +210,7 @@
                 <w:b/>
                 <w:sz w:val="16"/>
               </w:rPr>
-              <w:t>1-3</w:t>
+              <w:t>3</w:t>
             </w:r>
           </w:p>
           <w:p>
@@ -2996,7 +2996,7 @@
                 <w:b/>
                 <w:sz w:val="16"/>
               </w:rPr>
-              <w:t>1-3</w:t>
+              <w:t>1-2</w:t>
             </w:r>
           </w:p>
           <w:p>
@@ -3019,7 +3019,7 @@
                 <w:b/>
                 <w:sz w:val="16"/>
               </w:rPr>
-              <w:t>1-3</w:t>
+              <w:t>1-2</w:t>
             </w:r>
           </w:p>
           <w:p>
@@ -3042,7 +3042,7 @@
                 <w:b/>
                 <w:sz w:val="16"/>
               </w:rPr>
-              <w:t>1-3</w:t>
+              <w:t>1-2</w:t>
             </w:r>
           </w:p>
           <w:p>
@@ -3067,7 +3067,7 @@
                 <w:b/>
                 <w:sz w:val="16"/>
               </w:rPr>
-              <w:t>1-3</w:t>
+              <w:t>3</w:t>
             </w:r>
           </w:p>
           <w:p>
@@ -3090,7 +3090,7 @@
                 <w:b/>
                 <w:sz w:val="16"/>
               </w:rPr>
-              <w:t>1-3</w:t>
+              <w:t>3</w:t>
             </w:r>
           </w:p>
           <w:p>
@@ -3113,7 +3113,7 @@
                 <w:b/>
                 <w:sz w:val="16"/>
               </w:rPr>
-              <w:t>1-3</w:t>
+              <w:t>3</w:t>
             </w:r>
           </w:p>
           <w:p>
@@ -3209,7 +3209,7 @@
                 <w:b/>
                 <w:sz w:val="16"/>
               </w:rPr>
-              <w:t>5-6</w:t>
+              <w:t>5</w:t>
             </w:r>
           </w:p>
           <w:p>
@@ -3240,7 +3240,7 @@
                 <w:b/>
                 <w:sz w:val="16"/>
               </w:rPr>
-              <w:t>5-6</w:t>
+              <w:t>5</w:t>
             </w:r>
           </w:p>
           <w:p>
@@ -3263,7 +3263,7 @@
                 <w:b/>
                 <w:sz w:val="16"/>
               </w:rPr>
-              <w:t>5-6</w:t>
+              <w:t>5</w:t>
             </w:r>
           </w:p>
           <w:p>
@@ -3288,7 +3288,7 @@
                 <w:b/>
                 <w:sz w:val="16"/>
               </w:rPr>
-              <w:t>5-6</w:t>
+              <w:t>6</w:t>
             </w:r>
           </w:p>
           <w:p>
@@ -3311,7 +3311,7 @@
                 <w:b/>
                 <w:sz w:val="16"/>
               </w:rPr>
-              <w:t>5-6</w:t>
+              <w:t>6</w:t>
             </w:r>
           </w:p>
           <w:p>
@@ -3334,7 +3334,7 @@
                 <w:b/>
                 <w:sz w:val="16"/>
               </w:rPr>
-              <w:t>5-6</w:t>
+              <w:t>6</w:t>
             </w:r>
           </w:p>
           <w:p>
@@ -4239,7 +4239,7 @@
                 <w:b/>
                 <w:sz w:val="16"/>
               </w:rPr>
-              <w:t>6-9</w:t>
+              <w:t>6</w:t>
             </w:r>
           </w:p>
           <w:p>
@@ -4270,7 +4270,7 @@
                 <w:b/>
                 <w:sz w:val="16"/>
               </w:rPr>
-              <w:t>6-9</w:t>
+              <w:t>6</w:t>
             </w:r>
           </w:p>
           <w:p>
@@ -4293,7 +4293,7 @@
                 <w:b/>
                 <w:sz w:val="16"/>
               </w:rPr>
-              <w:t>6-9</w:t>
+              <w:t>6</w:t>
             </w:r>
           </w:p>
           <w:p>
@@ -4318,7 +4318,7 @@
                 <w:b/>
                 <w:sz w:val="16"/>
               </w:rPr>
-              <w:t>6-9</w:t>
+              <w:t>7-9</w:t>
             </w:r>
           </w:p>
           <w:p>
@@ -4341,7 +4341,7 @@
                 <w:b/>
                 <w:sz w:val="16"/>
               </w:rPr>
-              <w:t>6-9</w:t>
+              <w:t>7-9</w:t>
             </w:r>
           </w:p>
           <w:p>
@@ -4364,7 +4364,7 @@
                 <w:b/>
                 <w:sz w:val="16"/>
               </w:rPr>
-              <w:t>6-9</w:t>
+              <w:t>7-9</w:t>
             </w:r>
           </w:p>
           <w:p>
@@ -5174,7 +5174,7 @@
                 <w:b/>
                 <w:sz w:val="16"/>
               </w:rPr>
-              <w:t>7-8</w:t>
+              <w:t>7</w:t>
             </w:r>
           </w:p>
           <w:p>
@@ -5213,7 +5213,7 @@
                 <w:b/>
                 <w:sz w:val="16"/>
               </w:rPr>
-              <w:t>7-8</w:t>
+              <w:t>7</w:t>
             </w:r>
           </w:p>
           <w:p>
@@ -5236,7 +5236,7 @@
                 <w:b/>
                 <w:sz w:val="16"/>
               </w:rPr>
-              <w:t>7-8</w:t>
+              <w:t>7</w:t>
             </w:r>
           </w:p>
           <w:p>
@@ -5261,7 +5261,7 @@
                 <w:b/>
                 <w:sz w:val="16"/>
               </w:rPr>
-              <w:t>7-8</w:t>
+              <w:t>8</w:t>
             </w:r>
           </w:p>
           <w:p>
@@ -5284,7 +5284,7 @@
                 <w:b/>
                 <w:sz w:val="16"/>
               </w:rPr>
-              <w:t>7-8</w:t>
+              <w:t>8</w:t>
             </w:r>
           </w:p>
           <w:p>
@@ -5307,7 +5307,7 @@
                 <w:b/>
                 <w:sz w:val="16"/>
               </w:rPr>
-              <w:t>7-8</w:t>
+              <w:t>8</w:t>
             </w:r>
           </w:p>
           <w:p>
@@ -5332,7 +5332,7 @@
                 <w:b/>
                 <w:sz w:val="16"/>
               </w:rPr>
-              <w:t>7-8</w:t>
+              <w:t>8</w:t>
             </w:r>
           </w:p>
           <w:p>
@@ -5355,7 +5355,7 @@
                 <w:b/>
                 <w:sz w:val="16"/>
               </w:rPr>
-              <w:t>7-8</w:t>
+              <w:t>8</w:t>
             </w:r>
           </w:p>
           <w:p>
@@ -5378,7 +5378,7 @@
                 <w:b/>
                 <w:sz w:val="16"/>
               </w:rPr>
-              <w:t>7-8</w:t>
+              <w:t>8</w:t>
             </w:r>
           </w:p>
           <w:p>
@@ -6326,7 +6326,7 @@
                 <w:b/>
                 <w:sz w:val="16"/>
               </w:rPr>
-              <w:t>1-4</w:t>
+              <w:t>1</w:t>
             </w:r>
           </w:p>
           <w:p>
@@ -6349,7 +6349,7 @@
                 <w:b/>
                 <w:sz w:val="16"/>
               </w:rPr>
-              <w:t>1-4</w:t>
+              <w:t>1</w:t>
             </w:r>
           </w:p>
           <w:p>
@@ -6372,7 +6372,7 @@
                 <w:b/>
                 <w:sz w:val="16"/>
               </w:rPr>
-              <w:t>1-4</w:t>
+              <w:t>1</w:t>
             </w:r>
           </w:p>
           <w:p>
@@ -6397,7 +6397,7 @@
                 <w:b/>
                 <w:sz w:val="16"/>
               </w:rPr>
-              <w:t>1-4</w:t>
+              <w:t>2-4</w:t>
             </w:r>
           </w:p>
           <w:p>
@@ -6420,7 +6420,7 @@
                 <w:b/>
                 <w:sz w:val="16"/>
               </w:rPr>
-              <w:t>1-4</w:t>
+              <w:t>2-4</w:t>
             </w:r>
           </w:p>
           <w:p>
@@ -6443,7 +6443,7 @@
                 <w:b/>
                 <w:sz w:val="16"/>
               </w:rPr>
-              <w:t>1-4</w:t>
+              <w:t>2-4</w:t>
             </w:r>
           </w:p>
           <w:p>

</xml_diff>